<commit_message>
Inicializacao da documentacao do projecto de modelagem da dados do banco de dados; ajuste da tabela categoria, adicao das colunas grupo, subgrupo e famila
</commit_message>
<xml_diff>
--- a/Projecto I - Modelagem de Dados.docx
+++ b/Projecto I - Modelagem de Dados.docx
@@ -5,117 +5,24 @@
     <w:p>
       <w:pPr>
         <w:spacing w:line="360" w:lineRule="auto"/>
-        <w:jc w:val="both"/>
-        <w:rPr>
-          <w:rFonts w:ascii="Times New Roman" w:hAnsi="Times New Roman" w:cs="Times New Roman"/>
-          <w:sz w:val="24"/>
-          <w:szCs w:val="24"/>
-        </w:rPr>
-      </w:pPr>
-      <w:bookmarkStart w:id="0" w:name="_GoBack"/>
-      <w:r>
-        <w:rPr>
-          <w:rFonts w:ascii="Times New Roman" w:hAnsi="Times New Roman" w:cs="Times New Roman"/>
-          <w:sz w:val="24"/>
-          <w:szCs w:val="24"/>
-        </w:rPr>
-        <w:t>Projecto I</w:t>
-      </w:r>
-    </w:p>
-    <w:p>
-      <w:pPr>
-        <w:spacing w:line="360" w:lineRule="auto"/>
-        <w:jc w:val="both"/>
-        <w:rPr>
-          <w:rFonts w:ascii="Times New Roman" w:hAnsi="Times New Roman" w:cs="Times New Roman"/>
-          <w:sz w:val="24"/>
-          <w:szCs w:val="24"/>
-        </w:rPr>
-      </w:pPr>
-      <w:r>
-        <w:rPr>
-          <w:rFonts w:ascii="Times New Roman" w:hAnsi="Times New Roman" w:cs="Times New Roman"/>
-          <w:sz w:val="24"/>
-          <w:szCs w:val="24"/>
-        </w:rPr>
-        <w:t>Modelagem de dados</w:t>
-      </w:r>
-    </w:p>
-    <w:bookmarkEnd w:id="0"/>
-    <w:p>
-      <w:pPr>
-        <w:spacing w:line="360" w:lineRule="auto"/>
-        <w:jc w:val="both"/>
-        <w:rPr>
-          <w:rFonts w:ascii="Times New Roman" w:hAnsi="Times New Roman" w:cs="Times New Roman"/>
-          <w:sz w:val="24"/>
-          <w:szCs w:val="24"/>
-        </w:rPr>
-      </w:pPr>
-      <w:r>
-        <w:rPr>
-          <w:rFonts w:ascii="Times New Roman" w:hAnsi="Times New Roman" w:cs="Times New Roman"/>
-          <w:sz w:val="24"/>
-          <w:szCs w:val="24"/>
-        </w:rPr>
-        <w:t>Modelo conceitual</w:t>
-      </w:r>
-    </w:p>
-    <w:p>
-      <w:pPr>
-        <w:spacing w:line="360" w:lineRule="auto"/>
-        <w:jc w:val="both"/>
-        <w:rPr>
-          <w:rFonts w:ascii="Times New Roman" w:hAnsi="Times New Roman" w:cs="Times New Roman"/>
-          <w:sz w:val="24"/>
-          <w:szCs w:val="24"/>
-        </w:rPr>
-      </w:pPr>
-      <w:r>
-        <w:rPr>
-          <w:rFonts w:ascii="Times New Roman" w:hAnsi="Times New Roman" w:cs="Times New Roman"/>
-          <w:sz w:val="24"/>
-          <w:szCs w:val="24"/>
-        </w:rPr>
-        <w:t>Introdução</w:t>
-      </w:r>
-    </w:p>
-    <w:p>
-      <w:pPr>
-        <w:spacing w:line="360" w:lineRule="auto"/>
-        <w:jc w:val="both"/>
-        <w:rPr>
-          <w:rFonts w:ascii="Times New Roman" w:hAnsi="Times New Roman" w:cs="Times New Roman"/>
-          <w:sz w:val="24"/>
-          <w:szCs w:val="24"/>
-        </w:rPr>
-      </w:pPr>
-      <w:r>
-        <w:rPr>
-          <w:rFonts w:ascii="Times New Roman" w:hAnsi="Times New Roman" w:cs="Times New Roman"/>
-          <w:sz w:val="24"/>
-          <w:szCs w:val="24"/>
-        </w:rPr>
-        <w:t>Este documento visa apresentar uma modelagem</w:t>
-      </w:r>
-    </w:p>
-    <w:p>
-      <w:pPr>
-        <w:spacing w:line="360" w:lineRule="auto"/>
-        <w:jc w:val="both"/>
-        <w:rPr>
-          <w:rFonts w:ascii="Times New Roman" w:hAnsi="Times New Roman" w:cs="Times New Roman"/>
-          <w:sz w:val="24"/>
-          <w:szCs w:val="24"/>
-        </w:rPr>
-      </w:pPr>
-      <w:r>
-        <w:rPr>
-          <w:rFonts w:ascii="Times New Roman" w:hAnsi="Times New Roman" w:cs="Times New Roman"/>
-          <w:sz w:val="24"/>
-          <w:szCs w:val="24"/>
-        </w:rPr>
-        <w:t>Entidades do sistema</w:t>
+        <w:jc w:val="center"/>
+        <w:rPr>
+          <w:rFonts w:ascii="Times New Roman" w:hAnsi="Times New Roman" w:cs="Times New Roman"/>
+          <w:b/>
+          <w:bCs/>
+          <w:sz w:val="24"/>
+          <w:szCs w:val="24"/>
+        </w:rPr>
+      </w:pPr>
+      <w:r>
+        <w:rPr>
+          <w:rFonts w:ascii="Times New Roman" w:hAnsi="Times New Roman" w:cs="Times New Roman"/>
+          <w:b/>
+          <w:bCs/>
+          <w:sz w:val="24"/>
+          <w:szCs w:val="24"/>
+        </w:rPr>
+        <w:t>Projeto de Modelagem de Dados</w:t>
       </w:r>
     </w:p>
     <w:p>
@@ -123,23 +30,302 @@
         <w:pStyle w:val="ListParagraph"/>
         <w:numPr>
           <w:ilvl w:val="0"/>
-          <w:numId w:val="1"/>
+          <w:numId w:val="3"/>
         </w:numPr>
         <w:spacing w:line="360" w:lineRule="auto"/>
         <w:jc w:val="both"/>
         <w:rPr>
           <w:rFonts w:ascii="Times New Roman" w:hAnsi="Times New Roman" w:cs="Times New Roman"/>
-          <w:sz w:val="24"/>
-          <w:szCs w:val="24"/>
-        </w:rPr>
-      </w:pPr>
-      <w:r>
-        <w:rPr>
-          <w:rFonts w:ascii="Times New Roman" w:hAnsi="Times New Roman" w:cs="Times New Roman"/>
-          <w:sz w:val="24"/>
-          <w:szCs w:val="24"/>
-        </w:rPr>
-        <w:t>Cliente</w:t>
+          <w:b/>
+          <w:bCs/>
+          <w:sz w:val="24"/>
+          <w:szCs w:val="24"/>
+        </w:rPr>
+      </w:pPr>
+      <w:r>
+        <w:rPr>
+          <w:rFonts w:ascii="Times New Roman" w:hAnsi="Times New Roman" w:cs="Times New Roman"/>
+          <w:b/>
+          <w:bCs/>
+          <w:sz w:val="24"/>
+          <w:szCs w:val="24"/>
+        </w:rPr>
+        <w:t>Introdução</w:t>
+      </w:r>
+    </w:p>
+    <w:p>
+      <w:pPr>
+        <w:pStyle w:val="ListParagraph"/>
+        <w:numPr>
+          <w:ilvl w:val="1"/>
+          <w:numId w:val="3"/>
+        </w:numPr>
+        <w:spacing w:line="360" w:lineRule="auto"/>
+        <w:jc w:val="both"/>
+        <w:rPr>
+          <w:rFonts w:ascii="Times New Roman" w:hAnsi="Times New Roman" w:cs="Times New Roman"/>
+          <w:b/>
+          <w:bCs/>
+          <w:sz w:val="24"/>
+          <w:szCs w:val="24"/>
+        </w:rPr>
+      </w:pPr>
+      <w:r>
+        <w:rPr>
+          <w:rFonts w:ascii="Times New Roman" w:hAnsi="Times New Roman" w:cs="Times New Roman"/>
+          <w:b/>
+          <w:bCs/>
+          <w:sz w:val="24"/>
+          <w:szCs w:val="24"/>
+        </w:rPr>
+        <w:t>Objetivo do Projeto</w:t>
+      </w:r>
+    </w:p>
+    <w:p>
+      <w:pPr>
+        <w:spacing w:line="360" w:lineRule="auto"/>
+        <w:jc w:val="both"/>
+        <w:rPr>
+          <w:rFonts w:ascii="Times New Roman" w:hAnsi="Times New Roman" w:cs="Times New Roman"/>
+          <w:sz w:val="24"/>
+          <w:szCs w:val="24"/>
+        </w:rPr>
+      </w:pPr>
+      <w:r>
+        <w:rPr>
+          <w:rFonts w:ascii="Times New Roman" w:hAnsi="Times New Roman" w:cs="Times New Roman"/>
+          <w:sz w:val="24"/>
+          <w:szCs w:val="24"/>
+        </w:rPr>
+        <w:t>Este documento tem como objetivo definir a estrutur</w:t>
+      </w:r>
+      <w:r>
+        <w:rPr>
+          <w:rFonts w:ascii="Times New Roman" w:hAnsi="Times New Roman" w:cs="Times New Roman"/>
+          <w:sz w:val="24"/>
+          <w:szCs w:val="24"/>
+        </w:rPr>
+        <w:t xml:space="preserve">a do banco de dados para o </w:t>
+      </w:r>
+      <w:r>
+        <w:rPr>
+          <w:rFonts w:ascii="Times New Roman" w:hAnsi="Times New Roman" w:cs="Times New Roman"/>
+          <w:sz w:val="24"/>
+          <w:szCs w:val="24"/>
+        </w:rPr>
+        <w:t xml:space="preserve">JM&amp;ISC – </w:t>
+      </w:r>
+      <w:proofErr w:type="spellStart"/>
+      <w:r>
+        <w:rPr>
+          <w:rFonts w:ascii="Times New Roman" w:hAnsi="Times New Roman" w:cs="Times New Roman"/>
+          <w:b/>
+          <w:sz w:val="24"/>
+          <w:szCs w:val="24"/>
+        </w:rPr>
+        <w:t>J</w:t>
+      </w:r>
+      <w:r>
+        <w:rPr>
+          <w:rFonts w:ascii="Times New Roman" w:hAnsi="Times New Roman" w:cs="Times New Roman"/>
+          <w:sz w:val="24"/>
+          <w:szCs w:val="24"/>
+        </w:rPr>
+        <w:t>oin</w:t>
+      </w:r>
+      <w:proofErr w:type="spellEnd"/>
+      <w:r>
+        <w:rPr>
+          <w:rFonts w:ascii="Times New Roman" w:hAnsi="Times New Roman" w:cs="Times New Roman"/>
+          <w:sz w:val="24"/>
+          <w:szCs w:val="24"/>
+        </w:rPr>
+        <w:t xml:space="preserve"> </w:t>
+      </w:r>
+      <w:r>
+        <w:rPr>
+          <w:rFonts w:ascii="Times New Roman" w:hAnsi="Times New Roman" w:cs="Times New Roman"/>
+          <w:b/>
+          <w:sz w:val="24"/>
+          <w:szCs w:val="24"/>
+        </w:rPr>
+        <w:t>M</w:t>
+      </w:r>
+      <w:r>
+        <w:rPr>
+          <w:rFonts w:ascii="Times New Roman" w:hAnsi="Times New Roman" w:cs="Times New Roman"/>
+          <w:sz w:val="24"/>
+          <w:szCs w:val="24"/>
+        </w:rPr>
+        <w:t xml:space="preserve">anagement </w:t>
+      </w:r>
+      <w:r>
+        <w:rPr>
+          <w:rFonts w:ascii="Times New Roman" w:hAnsi="Times New Roman" w:cs="Times New Roman"/>
+          <w:sz w:val="24"/>
+          <w:szCs w:val="24"/>
+        </w:rPr>
+        <w:t>&amp;</w:t>
+      </w:r>
+      <w:r>
+        <w:rPr>
+          <w:rFonts w:ascii="Times New Roman" w:hAnsi="Times New Roman" w:cs="Times New Roman"/>
+          <w:sz w:val="24"/>
+          <w:szCs w:val="24"/>
+        </w:rPr>
+        <w:t xml:space="preserve"> </w:t>
+      </w:r>
+      <w:proofErr w:type="spellStart"/>
+      <w:r>
+        <w:rPr>
+          <w:rFonts w:ascii="Times New Roman" w:hAnsi="Times New Roman" w:cs="Times New Roman"/>
+          <w:b/>
+          <w:sz w:val="24"/>
+          <w:szCs w:val="24"/>
+        </w:rPr>
+        <w:t>I</w:t>
+      </w:r>
+      <w:r>
+        <w:rPr>
+          <w:rFonts w:ascii="Times New Roman" w:hAnsi="Times New Roman" w:cs="Times New Roman"/>
+          <w:sz w:val="24"/>
+          <w:szCs w:val="24"/>
+        </w:rPr>
+        <w:t>nvoice</w:t>
+      </w:r>
+      <w:proofErr w:type="spellEnd"/>
+      <w:r>
+        <w:rPr>
+          <w:rFonts w:ascii="Times New Roman" w:hAnsi="Times New Roman" w:cs="Times New Roman"/>
+          <w:sz w:val="24"/>
+          <w:szCs w:val="24"/>
+        </w:rPr>
+        <w:t xml:space="preserve"> </w:t>
+      </w:r>
+      <w:proofErr w:type="spellStart"/>
+      <w:r>
+        <w:rPr>
+          <w:rFonts w:ascii="Times New Roman" w:hAnsi="Times New Roman" w:cs="Times New Roman"/>
+          <w:b/>
+          <w:sz w:val="24"/>
+          <w:szCs w:val="24"/>
+        </w:rPr>
+        <w:t>S</w:t>
+      </w:r>
+      <w:r>
+        <w:rPr>
+          <w:rFonts w:ascii="Times New Roman" w:hAnsi="Times New Roman" w:cs="Times New Roman"/>
+          <w:sz w:val="24"/>
+          <w:szCs w:val="24"/>
+        </w:rPr>
+        <w:t>torage</w:t>
+      </w:r>
+      <w:proofErr w:type="spellEnd"/>
+      <w:r>
+        <w:rPr>
+          <w:rFonts w:ascii="Times New Roman" w:hAnsi="Times New Roman" w:cs="Times New Roman"/>
+          <w:sz w:val="24"/>
+          <w:szCs w:val="24"/>
+        </w:rPr>
+        <w:t xml:space="preserve"> </w:t>
+      </w:r>
+      <w:proofErr w:type="spellStart"/>
+      <w:r>
+        <w:rPr>
+          <w:rFonts w:ascii="Times New Roman" w:hAnsi="Times New Roman" w:cs="Times New Roman"/>
+          <w:b/>
+          <w:sz w:val="24"/>
+          <w:szCs w:val="24"/>
+        </w:rPr>
+        <w:t>C</w:t>
+      </w:r>
+      <w:r>
+        <w:rPr>
+          <w:rFonts w:ascii="Times New Roman" w:hAnsi="Times New Roman" w:cs="Times New Roman"/>
+          <w:sz w:val="24"/>
+          <w:szCs w:val="24"/>
+        </w:rPr>
+        <w:t>ontrol</w:t>
+      </w:r>
+      <w:proofErr w:type="spellEnd"/>
+      <w:r>
+        <w:rPr>
+          <w:rFonts w:ascii="Times New Roman" w:hAnsi="Times New Roman" w:cs="Times New Roman"/>
+          <w:sz w:val="24"/>
+          <w:szCs w:val="24"/>
+        </w:rPr>
+        <w:t xml:space="preserve">, um sistema que será desenvolvido para </w:t>
+      </w:r>
+      <w:r>
+        <w:rPr>
+          <w:rFonts w:ascii="Times New Roman" w:hAnsi="Times New Roman" w:cs="Times New Roman"/>
+          <w:sz w:val="24"/>
+          <w:szCs w:val="24"/>
+        </w:rPr>
+        <w:t>gestão e controle de produtos em estoque e emissão de facturas</w:t>
+      </w:r>
+      <w:r>
+        <w:rPr>
+          <w:rFonts w:ascii="Times New Roman" w:hAnsi="Times New Roman" w:cs="Times New Roman"/>
+          <w:sz w:val="24"/>
+          <w:szCs w:val="24"/>
+        </w:rPr>
+        <w:t xml:space="preserve">. O banco de dados será usado para </w:t>
+      </w:r>
+      <w:r>
+        <w:rPr>
+          <w:rFonts w:ascii="Times New Roman" w:hAnsi="Times New Roman" w:cs="Times New Roman"/>
+          <w:sz w:val="24"/>
+          <w:szCs w:val="24"/>
+        </w:rPr>
+        <w:t>armazenar informação dos clientes, fornecedores e produtos por eles fornecidos (entradas para o estoque), facturas emitidas (saídas do estoque) para os clientes, dados de pagamento das facturas, métodos de pagamento, notas de debito, créditos e outros documentos comercias de interesse, configurações do sistema, etc…</w:t>
+      </w:r>
+    </w:p>
+    <w:p>
+      <w:pPr>
+        <w:pStyle w:val="ListParagraph"/>
+        <w:numPr>
+          <w:ilvl w:val="1"/>
+          <w:numId w:val="3"/>
+        </w:numPr>
+        <w:spacing w:line="360" w:lineRule="auto"/>
+        <w:jc w:val="both"/>
+        <w:rPr>
+          <w:rFonts w:ascii="Times New Roman" w:hAnsi="Times New Roman" w:cs="Times New Roman"/>
+          <w:b/>
+          <w:bCs/>
+          <w:sz w:val="24"/>
+          <w:szCs w:val="24"/>
+        </w:rPr>
+      </w:pPr>
+      <w:r>
+        <w:rPr>
+          <w:rFonts w:ascii="Times New Roman" w:hAnsi="Times New Roman" w:cs="Times New Roman"/>
+          <w:b/>
+          <w:bCs/>
+          <w:sz w:val="24"/>
+          <w:szCs w:val="24"/>
+        </w:rPr>
+        <w:t>Escopo</w:t>
+      </w:r>
+    </w:p>
+    <w:p>
+      <w:pPr>
+        <w:spacing w:line="360" w:lineRule="auto"/>
+        <w:jc w:val="both"/>
+        <w:rPr>
+          <w:rFonts w:ascii="Times New Roman" w:hAnsi="Times New Roman" w:cs="Times New Roman"/>
+          <w:sz w:val="24"/>
+          <w:szCs w:val="24"/>
+        </w:rPr>
+      </w:pPr>
+      <w:r>
+        <w:rPr>
+          <w:rFonts w:ascii="Times New Roman" w:hAnsi="Times New Roman" w:cs="Times New Roman"/>
+          <w:sz w:val="24"/>
+          <w:szCs w:val="24"/>
+        </w:rPr>
+        <w:t>O escopo deste projeto abrange a modelagem conceitual, lógica e física do banco de dados, incluindo a definição de tabelas, relacionamentos, restrições, chaves primárias e estrangeiras, índices, e outras estruturas necessárias para atender aos requisitos do sistema.</w:t>
       </w:r>
     </w:p>
     <w:p>
@@ -147,7 +333,7 @@
         <w:pStyle w:val="ListParagraph"/>
         <w:numPr>
           <w:ilvl w:val="0"/>
-          <w:numId w:val="1"/>
+          <w:numId w:val="3"/>
         </w:numPr>
         <w:spacing w:line="360" w:lineRule="auto"/>
         <w:jc w:val="both"/>
@@ -160,10 +346,87 @@
       <w:r>
         <w:rPr>
           <w:rFonts w:ascii="Times New Roman" w:hAnsi="Times New Roman" w:cs="Times New Roman"/>
-          <w:sz w:val="24"/>
-          <w:szCs w:val="24"/>
-        </w:rPr>
-        <w:t>Contacto do cliente</w:t>
+          <w:b/>
+          <w:bCs/>
+          <w:sz w:val="24"/>
+          <w:szCs w:val="24"/>
+          <w:lang w:val="pt-BR"/>
+        </w:rPr>
+        <w:t>Análise de Requisitos</w:t>
+      </w:r>
+    </w:p>
+    <w:p>
+      <w:pPr>
+        <w:pStyle w:val="ListParagraph"/>
+        <w:numPr>
+          <w:ilvl w:val="1"/>
+          <w:numId w:val="3"/>
+        </w:numPr>
+        <w:spacing w:line="360" w:lineRule="auto"/>
+        <w:jc w:val="both"/>
+        <w:rPr>
+          <w:rFonts w:ascii="Times New Roman" w:hAnsi="Times New Roman" w:cs="Times New Roman"/>
+          <w:sz w:val="24"/>
+          <w:szCs w:val="24"/>
+        </w:rPr>
+      </w:pPr>
+      <w:r>
+        <w:rPr>
+          <w:rFonts w:ascii="Times New Roman" w:hAnsi="Times New Roman" w:cs="Times New Roman"/>
+          <w:b/>
+          <w:bCs/>
+          <w:sz w:val="24"/>
+          <w:szCs w:val="24"/>
+          <w:lang w:val="pt-BR"/>
+        </w:rPr>
+        <w:t>Requisitos de Negócio</w:t>
+      </w:r>
+    </w:p>
+    <w:p>
+      <w:pPr>
+        <w:pStyle w:val="ListParagraph"/>
+        <w:numPr>
+          <w:ilvl w:val="2"/>
+          <w:numId w:val="3"/>
+        </w:numPr>
+        <w:spacing w:line="360" w:lineRule="auto"/>
+        <w:jc w:val="both"/>
+        <w:rPr>
+          <w:rFonts w:ascii="Times New Roman" w:hAnsi="Times New Roman" w:cs="Times New Roman"/>
+          <w:b/>
+          <w:sz w:val="24"/>
+          <w:szCs w:val="24"/>
+        </w:rPr>
+      </w:pPr>
+      <w:r>
+        <w:rPr>
+          <w:rFonts w:ascii="Times New Roman" w:hAnsi="Times New Roman" w:cs="Times New Roman"/>
+          <w:b/>
+          <w:sz w:val="24"/>
+          <w:szCs w:val="24"/>
+        </w:rPr>
+        <w:t>Requisitos funcionais</w:t>
+      </w:r>
+    </w:p>
+    <w:p>
+      <w:pPr>
+        <w:pStyle w:val="ListParagraph"/>
+        <w:spacing w:line="360" w:lineRule="auto"/>
+        <w:ind w:left="1800"/>
+        <w:jc w:val="both"/>
+        <w:rPr>
+          <w:rFonts w:ascii="Times New Roman" w:hAnsi="Times New Roman" w:cs="Times New Roman"/>
+          <w:sz w:val="24"/>
+          <w:szCs w:val="24"/>
+        </w:rPr>
+      </w:pPr>
+      <w:r>
+        <w:rPr>
+          <w:rFonts w:ascii="Times New Roman" w:hAnsi="Times New Roman" w:cs="Times New Roman"/>
+          <w:sz w:val="24"/>
+          <w:szCs w:val="24"/>
+        </w:rPr>
+        <w:t>O banco de dados deve permitir que sejam armazenadas as seguintes informações:</w:t>
       </w:r>
     </w:p>
     <w:p>
@@ -171,7 +434,7 @@
         <w:pStyle w:val="ListParagraph"/>
         <w:numPr>
           <w:ilvl w:val="0"/>
-          <w:numId w:val="1"/>
+          <w:numId w:val="7"/>
         </w:numPr>
         <w:spacing w:line="360" w:lineRule="auto"/>
         <w:jc w:val="both"/>
@@ -187,7 +450,31 @@
           <w:sz w:val="24"/>
           <w:szCs w:val="24"/>
         </w:rPr>
-        <w:t>Endereço do cliente</w:t>
+        <w:t>Dados dos clientes</w:t>
+      </w:r>
+      <w:r>
+        <w:rPr>
+          <w:rFonts w:ascii="Times New Roman" w:hAnsi="Times New Roman" w:cs="Times New Roman"/>
+          <w:sz w:val="24"/>
+          <w:szCs w:val="24"/>
+        </w:rPr>
+        <w:t xml:space="preserve"> e fornecedores</w:t>
+      </w:r>
+      <w:r>
+        <w:rPr>
+          <w:rFonts w:ascii="Times New Roman" w:hAnsi="Times New Roman" w:cs="Times New Roman"/>
+          <w:sz w:val="24"/>
+          <w:szCs w:val="24"/>
+        </w:rPr>
+        <w:t xml:space="preserve"> com informações detalhadas, incluído nome, </w:t>
+      </w:r>
+      <w:r>
+        <w:rPr>
+          <w:rFonts w:ascii="Times New Roman" w:hAnsi="Times New Roman" w:cs="Times New Roman"/>
+          <w:sz w:val="24"/>
+          <w:szCs w:val="24"/>
+        </w:rPr>
+        <w:t>endereço e informações de contacto;</w:t>
       </w:r>
     </w:p>
     <w:p>
@@ -195,7 +482,7 @@
         <w:pStyle w:val="ListParagraph"/>
         <w:numPr>
           <w:ilvl w:val="0"/>
-          <w:numId w:val="1"/>
+          <w:numId w:val="7"/>
         </w:numPr>
         <w:spacing w:line="360" w:lineRule="auto"/>
         <w:jc w:val="both"/>
@@ -211,7 +498,15 @@
           <w:sz w:val="24"/>
           <w:szCs w:val="24"/>
         </w:rPr>
-        <w:t>Factura</w:t>
+        <w:t>Informação dos produtos e serviços devidamente categorizados, taxa e/ou impostos associados aos mesmos. Em caso de produtos, informações que relacionam o produto com o seu fornecedor, formas de medição ou contagem, quem efectuo a recepção dos mesmos (caso seja um produto), entre outras informações que sej</w:t>
+      </w:r>
+      <w:r>
+        <w:rPr>
+          <w:rFonts w:ascii="Times New Roman" w:hAnsi="Times New Roman" w:cs="Times New Roman"/>
+          <w:sz w:val="24"/>
+          <w:szCs w:val="24"/>
+        </w:rPr>
+        <w:t>am importantes saber;</w:t>
       </w:r>
     </w:p>
     <w:p>
@@ -219,7 +514,7 @@
         <w:pStyle w:val="ListParagraph"/>
         <w:numPr>
           <w:ilvl w:val="0"/>
-          <w:numId w:val="1"/>
+          <w:numId w:val="7"/>
         </w:numPr>
         <w:spacing w:line="360" w:lineRule="auto"/>
         <w:jc w:val="both"/>
@@ -235,7 +530,24 @@
           <w:sz w:val="24"/>
           <w:szCs w:val="24"/>
         </w:rPr>
-        <w:t>Item da factura</w:t>
+        <w:t>Informações do facturamento dos produtos e/ou serviços, como itens da factura, pagamentos e seus métodos,</w:t>
+      </w:r>
+      <w:r>
+        <w:rPr>
+          <w:rFonts w:ascii="Times New Roman" w:hAnsi="Times New Roman" w:cs="Times New Roman"/>
+          <w:sz w:val="24"/>
+          <w:szCs w:val="24"/>
+        </w:rPr>
+        <w:t xml:space="preserve"> descontos </w:t>
+      </w:r>
+      <w:r>
+        <w:rPr>
+          <w:rFonts w:ascii="Times New Roman" w:hAnsi="Times New Roman" w:cs="Times New Roman"/>
+          <w:sz w:val="24"/>
+          <w:szCs w:val="24"/>
+        </w:rPr>
+        <w:lastRenderedPageBreak/>
+        <w:t>se existirem, notas de credito e/ou debito, recibos e outros documentos de interesse comercial se necessário;</w:t>
       </w:r>
     </w:p>
     <w:p>
@@ -243,7 +555,7 @@
         <w:pStyle w:val="ListParagraph"/>
         <w:numPr>
           <w:ilvl w:val="0"/>
-          <w:numId w:val="1"/>
+          <w:numId w:val="7"/>
         </w:numPr>
         <w:spacing w:line="360" w:lineRule="auto"/>
         <w:jc w:val="both"/>
@@ -259,15 +571,15 @@
           <w:sz w:val="24"/>
           <w:szCs w:val="24"/>
         </w:rPr>
-        <w:t>Produto</w:t>
-      </w:r>
-      <w:r>
-        <w:rPr>
-          <w:rFonts w:ascii="Times New Roman" w:hAnsi="Times New Roman" w:cs="Times New Roman"/>
-          <w:sz w:val="24"/>
-          <w:szCs w:val="24"/>
-        </w:rPr>
-        <w:t xml:space="preserve"> e/ou serviço</w:t>
+        <w:t xml:space="preserve">Informações sobre a empresa e, outras informações pertinentes </w:t>
+      </w:r>
+      <w:r>
+        <w:rPr>
+          <w:rFonts w:ascii="Times New Roman" w:hAnsi="Times New Roman" w:cs="Times New Roman"/>
+          <w:sz w:val="24"/>
+          <w:szCs w:val="24"/>
+        </w:rPr>
+        <w:t>ao sistema que faz o facturamento e controle de estoque;</w:t>
       </w:r>
     </w:p>
     <w:p>
@@ -275,7 +587,7 @@
         <w:pStyle w:val="ListParagraph"/>
         <w:numPr>
           <w:ilvl w:val="0"/>
-          <w:numId w:val="1"/>
+          <w:numId w:val="7"/>
         </w:numPr>
         <w:spacing w:line="360" w:lineRule="auto"/>
         <w:jc w:val="both"/>
@@ -291,7 +603,177 @@
           <w:sz w:val="24"/>
           <w:szCs w:val="24"/>
         </w:rPr>
-        <w:t>Produto fornecido</w:t>
+        <w:t>Registras as informações de entrada e saída de produtos do armazém ou armazéns, bem como as informações de que procedeu com tais ações.</w:t>
+      </w:r>
+    </w:p>
+    <w:p>
+      <w:pPr>
+        <w:pStyle w:val="ListParagraph"/>
+        <w:numPr>
+          <w:ilvl w:val="2"/>
+          <w:numId w:val="3"/>
+        </w:numPr>
+        <w:spacing w:line="360" w:lineRule="auto"/>
+        <w:jc w:val="both"/>
+        <w:rPr>
+          <w:rFonts w:ascii="Times New Roman" w:hAnsi="Times New Roman" w:cs="Times New Roman"/>
+          <w:b/>
+          <w:sz w:val="24"/>
+          <w:szCs w:val="24"/>
+        </w:rPr>
+      </w:pPr>
+      <w:r>
+        <w:rPr>
+          <w:rFonts w:ascii="Times New Roman" w:hAnsi="Times New Roman" w:cs="Times New Roman"/>
+          <w:b/>
+          <w:sz w:val="24"/>
+          <w:szCs w:val="24"/>
+        </w:rPr>
+        <w:t>Requisitos não funcionais:</w:t>
+      </w:r>
+    </w:p>
+    <w:p>
+      <w:pPr>
+        <w:pStyle w:val="ListParagraph"/>
+        <w:numPr>
+          <w:ilvl w:val="1"/>
+          <w:numId w:val="3"/>
+        </w:numPr>
+        <w:spacing w:line="360" w:lineRule="auto"/>
+        <w:jc w:val="both"/>
+        <w:rPr>
+          <w:rFonts w:ascii="Times New Roman" w:hAnsi="Times New Roman" w:cs="Times New Roman"/>
+          <w:b/>
+          <w:sz w:val="24"/>
+          <w:szCs w:val="24"/>
+        </w:rPr>
+      </w:pPr>
+      <w:r>
+        <w:rPr>
+          <w:rFonts w:ascii="Times New Roman" w:hAnsi="Times New Roman" w:cs="Times New Roman"/>
+          <w:b/>
+          <w:sz w:val="24"/>
+          <w:szCs w:val="24"/>
+        </w:rPr>
+        <w:t>Regras de negócio</w:t>
+      </w:r>
+    </w:p>
+    <w:p>
+      <w:pPr>
+        <w:pStyle w:val="ListParagraph"/>
+        <w:spacing w:line="360" w:lineRule="auto"/>
+        <w:ind w:left="1080"/>
+        <w:jc w:val="both"/>
+        <w:rPr>
+          <w:rFonts w:ascii="Times New Roman" w:hAnsi="Times New Roman" w:cs="Times New Roman"/>
+          <w:sz w:val="24"/>
+          <w:szCs w:val="24"/>
+        </w:rPr>
+      </w:pPr>
+      <w:r>
+        <w:rPr>
+          <w:rFonts w:ascii="Times New Roman" w:hAnsi="Times New Roman" w:cs="Times New Roman"/>
+          <w:sz w:val="24"/>
+          <w:szCs w:val="24"/>
+        </w:rPr>
+        <w:t>I</w:t>
+      </w:r>
+      <w:r>
+        <w:rPr>
+          <w:rFonts w:ascii="Times New Roman" w:hAnsi="Times New Roman" w:cs="Times New Roman"/>
+          <w:sz w:val="24"/>
+          <w:szCs w:val="24"/>
+        </w:rPr>
+        <w:t xml:space="preserve">nformações como a persistência de dados dos clientes, fornecedores, serviços e outros serão simples ações, mas informações como a persistência de dados de produtos fornecidos e emissão de facturas, deverão disparar </w:t>
+      </w:r>
+      <w:r>
+        <w:rPr>
+          <w:rFonts w:ascii="Times New Roman" w:hAnsi="Times New Roman" w:cs="Times New Roman"/>
+          <w:sz w:val="24"/>
+          <w:szCs w:val="24"/>
+        </w:rPr>
+        <w:t>ações</w:t>
+      </w:r>
+      <w:r>
+        <w:rPr>
+          <w:rFonts w:ascii="Times New Roman" w:hAnsi="Times New Roman" w:cs="Times New Roman"/>
+          <w:sz w:val="24"/>
+          <w:szCs w:val="24"/>
+        </w:rPr>
+        <w:t xml:space="preserve"> que </w:t>
+      </w:r>
+      <w:r>
+        <w:rPr>
+          <w:rFonts w:ascii="Times New Roman" w:hAnsi="Times New Roman" w:cs="Times New Roman"/>
+          <w:sz w:val="24"/>
+          <w:szCs w:val="24"/>
+        </w:rPr>
+        <w:t>persistirão</w:t>
+      </w:r>
+      <w:r>
+        <w:rPr>
+          <w:rFonts w:ascii="Times New Roman" w:hAnsi="Times New Roman" w:cs="Times New Roman"/>
+          <w:sz w:val="24"/>
+          <w:szCs w:val="24"/>
+        </w:rPr>
+        <w:t xml:space="preserve"> dados a tabelas adicionais para tornar possível </w:t>
+      </w:r>
+      <w:r>
+        <w:rPr>
+          <w:rFonts w:ascii="Times New Roman" w:hAnsi="Times New Roman" w:cs="Times New Roman"/>
+          <w:sz w:val="24"/>
+          <w:szCs w:val="24"/>
+        </w:rPr>
+        <w:t>o controle de fluxo no estoque de produtos nos armazéns.</w:t>
+      </w:r>
+    </w:p>
+    <w:p>
+      <w:pPr>
+        <w:pStyle w:val="ListParagraph"/>
+        <w:numPr>
+          <w:ilvl w:val="1"/>
+          <w:numId w:val="3"/>
+        </w:numPr>
+        <w:spacing w:line="360" w:lineRule="auto"/>
+        <w:jc w:val="both"/>
+        <w:rPr>
+          <w:rFonts w:ascii="Times New Roman" w:hAnsi="Times New Roman" w:cs="Times New Roman"/>
+          <w:b/>
+          <w:sz w:val="24"/>
+          <w:szCs w:val="24"/>
+        </w:rPr>
+      </w:pPr>
+      <w:r>
+        <w:rPr>
+          <w:rFonts w:ascii="Times New Roman" w:hAnsi="Times New Roman" w:cs="Times New Roman"/>
+          <w:b/>
+          <w:sz w:val="24"/>
+          <w:szCs w:val="24"/>
+        </w:rPr>
+        <w:t>Requisitos de Dados</w:t>
+      </w:r>
+    </w:p>
+    <w:p>
+      <w:pPr>
+        <w:pStyle w:val="ListParagraph"/>
+        <w:spacing w:line="360" w:lineRule="auto"/>
+        <w:ind w:left="1080"/>
+        <w:jc w:val="both"/>
+        <w:rPr>
+          <w:rFonts w:ascii="Times New Roman" w:hAnsi="Times New Roman" w:cs="Times New Roman"/>
+          <w:b/>
+          <w:sz w:val="24"/>
+          <w:szCs w:val="24"/>
+        </w:rPr>
+      </w:pPr>
+      <w:r>
+        <w:rPr>
+          <w:rFonts w:ascii="Times New Roman" w:hAnsi="Times New Roman" w:cs="Times New Roman"/>
+          <w:b/>
+          <w:sz w:val="24"/>
+          <w:szCs w:val="24"/>
+        </w:rPr>
+        <w:t>Identificação das principais entidades:</w:t>
       </w:r>
     </w:p>
     <w:p>
@@ -299,7 +781,7 @@
         <w:pStyle w:val="ListParagraph"/>
         <w:numPr>
           <w:ilvl w:val="0"/>
-          <w:numId w:val="1"/>
+          <w:numId w:val="8"/>
         </w:numPr>
         <w:spacing w:line="360" w:lineRule="auto"/>
         <w:jc w:val="both"/>
@@ -315,7 +797,7 @@
           <w:sz w:val="24"/>
           <w:szCs w:val="24"/>
         </w:rPr>
-        <w:t>Desconto</w:t>
+        <w:t>Cliente</w:t>
       </w:r>
     </w:p>
     <w:p>
@@ -323,7 +805,7 @@
         <w:pStyle w:val="ListParagraph"/>
         <w:numPr>
           <w:ilvl w:val="0"/>
-          <w:numId w:val="1"/>
+          <w:numId w:val="8"/>
         </w:numPr>
         <w:spacing w:line="360" w:lineRule="auto"/>
         <w:jc w:val="both"/>
@@ -339,7 +821,7 @@
           <w:sz w:val="24"/>
           <w:szCs w:val="24"/>
         </w:rPr>
-        <w:t>Pagamento</w:t>
+        <w:t>Fornecedor</w:t>
       </w:r>
     </w:p>
     <w:p>
@@ -347,7 +829,7 @@
         <w:pStyle w:val="ListParagraph"/>
         <w:numPr>
           <w:ilvl w:val="0"/>
-          <w:numId w:val="1"/>
+          <w:numId w:val="8"/>
         </w:numPr>
         <w:spacing w:line="360" w:lineRule="auto"/>
         <w:jc w:val="both"/>
@@ -363,7 +845,7 @@
           <w:sz w:val="24"/>
           <w:szCs w:val="24"/>
         </w:rPr>
-        <w:t>Método de pagamento</w:t>
+        <w:t>Categoria (de produto e serviço)</w:t>
       </w:r>
     </w:p>
     <w:p>
@@ -371,7 +853,7 @@
         <w:pStyle w:val="ListParagraph"/>
         <w:numPr>
           <w:ilvl w:val="0"/>
-          <w:numId w:val="1"/>
+          <w:numId w:val="8"/>
         </w:numPr>
         <w:spacing w:line="360" w:lineRule="auto"/>
         <w:jc w:val="both"/>
@@ -387,7 +869,7 @@
           <w:sz w:val="24"/>
           <w:szCs w:val="24"/>
         </w:rPr>
-        <w:t>Taxa/imposto</w:t>
+        <w:t>Factura e itens da factura</w:t>
       </w:r>
     </w:p>
     <w:p>
@@ -395,7 +877,7 @@
         <w:pStyle w:val="ListParagraph"/>
         <w:numPr>
           <w:ilvl w:val="0"/>
-          <w:numId w:val="1"/>
+          <w:numId w:val="8"/>
         </w:numPr>
         <w:spacing w:line="360" w:lineRule="auto"/>
         <w:jc w:val="both"/>
@@ -411,7 +893,7 @@
           <w:sz w:val="24"/>
           <w:szCs w:val="24"/>
         </w:rPr>
-        <w:t>Categoria do produto e/ou serviço</w:t>
+        <w:t>Pagamento e métodos de pagamento</w:t>
       </w:r>
     </w:p>
     <w:p>
@@ -419,7 +901,7 @@
         <w:pStyle w:val="ListParagraph"/>
         <w:numPr>
           <w:ilvl w:val="0"/>
-          <w:numId w:val="1"/>
+          <w:numId w:val="8"/>
         </w:numPr>
         <w:spacing w:line="360" w:lineRule="auto"/>
         <w:jc w:val="both"/>
@@ -435,7 +917,7 @@
           <w:sz w:val="24"/>
           <w:szCs w:val="24"/>
         </w:rPr>
-        <w:t>Movimentação de estoque</w:t>
+        <w:t>Produto</w:t>
       </w:r>
     </w:p>
     <w:p>
@@ -443,7 +925,7 @@
         <w:pStyle w:val="ListParagraph"/>
         <w:numPr>
           <w:ilvl w:val="0"/>
-          <w:numId w:val="1"/>
+          <w:numId w:val="8"/>
         </w:numPr>
         <w:spacing w:line="360" w:lineRule="auto"/>
         <w:jc w:val="both"/>
@@ -459,7 +941,7 @@
           <w:sz w:val="24"/>
           <w:szCs w:val="24"/>
         </w:rPr>
-        <w:t>Armazém</w:t>
+        <w:t>Serviço</w:t>
       </w:r>
     </w:p>
     <w:p>
@@ -467,7 +949,7 @@
         <w:pStyle w:val="ListParagraph"/>
         <w:numPr>
           <w:ilvl w:val="0"/>
-          <w:numId w:val="1"/>
+          <w:numId w:val="8"/>
         </w:numPr>
         <w:spacing w:line="360" w:lineRule="auto"/>
         <w:jc w:val="both"/>
@@ -483,7 +965,7 @@
           <w:sz w:val="24"/>
           <w:szCs w:val="24"/>
         </w:rPr>
-        <w:t>Unidade de medida do produto</w:t>
+        <w:t>Taxa e/ou imposto</w:t>
       </w:r>
     </w:p>
     <w:p>
@@ -491,7 +973,7 @@
         <w:pStyle w:val="ListParagraph"/>
         <w:numPr>
           <w:ilvl w:val="0"/>
-          <w:numId w:val="1"/>
+          <w:numId w:val="8"/>
         </w:numPr>
         <w:spacing w:line="360" w:lineRule="auto"/>
         <w:jc w:val="both"/>
@@ -507,7 +989,7 @@
           <w:sz w:val="24"/>
           <w:szCs w:val="24"/>
         </w:rPr>
-        <w:t xml:space="preserve">Fornecedor </w:t>
+        <w:t>Descontos</w:t>
       </w:r>
     </w:p>
     <w:p>
@@ -515,7 +997,7 @@
         <w:pStyle w:val="ListParagraph"/>
         <w:numPr>
           <w:ilvl w:val="0"/>
-          <w:numId w:val="1"/>
+          <w:numId w:val="8"/>
         </w:numPr>
         <w:spacing w:line="360" w:lineRule="auto"/>
         <w:jc w:val="both"/>
@@ -531,7 +1013,7 @@
           <w:sz w:val="24"/>
           <w:szCs w:val="24"/>
         </w:rPr>
-        <w:t>Contacto fornecedor</w:t>
+        <w:t>Armazém</w:t>
       </w:r>
     </w:p>
     <w:p>
@@ -539,7 +1021,7 @@
         <w:pStyle w:val="ListParagraph"/>
         <w:numPr>
           <w:ilvl w:val="0"/>
-          <w:numId w:val="1"/>
+          <w:numId w:val="8"/>
         </w:numPr>
         <w:spacing w:line="360" w:lineRule="auto"/>
         <w:jc w:val="both"/>
@@ -555,7 +1037,7 @@
           <w:sz w:val="24"/>
           <w:szCs w:val="24"/>
         </w:rPr>
-        <w:t>Endereço fornecedor</w:t>
+        <w:t>Unidade de medida</w:t>
       </w:r>
     </w:p>
     <w:p>
@@ -563,7 +1045,7 @@
         <w:pStyle w:val="ListParagraph"/>
         <w:numPr>
           <w:ilvl w:val="0"/>
-          <w:numId w:val="1"/>
+          <w:numId w:val="8"/>
         </w:numPr>
         <w:spacing w:line="360" w:lineRule="auto"/>
         <w:jc w:val="both"/>
@@ -579,115 +1061,83 @@
           <w:sz w:val="24"/>
           <w:szCs w:val="24"/>
         </w:rPr>
-        <w:t>Empresa</w:t>
-      </w:r>
-    </w:p>
-    <w:p>
-      <w:pPr>
-        <w:pStyle w:val="ListParagraph"/>
-        <w:numPr>
-          <w:ilvl w:val="0"/>
-          <w:numId w:val="1"/>
-        </w:numPr>
-        <w:spacing w:line="360" w:lineRule="auto"/>
-        <w:jc w:val="both"/>
-        <w:rPr>
-          <w:rFonts w:ascii="Times New Roman" w:hAnsi="Times New Roman" w:cs="Times New Roman"/>
-          <w:sz w:val="24"/>
-          <w:szCs w:val="24"/>
-        </w:rPr>
-      </w:pPr>
-      <w:r>
-        <w:rPr>
-          <w:rFonts w:ascii="Times New Roman" w:hAnsi="Times New Roman" w:cs="Times New Roman"/>
-          <w:sz w:val="24"/>
-          <w:szCs w:val="24"/>
-        </w:rPr>
-        <w:t>Contacto empresa</w:t>
-      </w:r>
-    </w:p>
-    <w:p>
-      <w:pPr>
-        <w:pStyle w:val="ListParagraph"/>
-        <w:numPr>
-          <w:ilvl w:val="0"/>
-          <w:numId w:val="1"/>
-        </w:numPr>
-        <w:spacing w:line="360" w:lineRule="auto"/>
-        <w:jc w:val="both"/>
-        <w:rPr>
-          <w:rFonts w:ascii="Times New Roman" w:hAnsi="Times New Roman" w:cs="Times New Roman"/>
-          <w:sz w:val="24"/>
-          <w:szCs w:val="24"/>
-        </w:rPr>
-      </w:pPr>
-      <w:r>
-        <w:rPr>
-          <w:rFonts w:ascii="Times New Roman" w:hAnsi="Times New Roman" w:cs="Times New Roman"/>
-          <w:sz w:val="24"/>
-          <w:szCs w:val="24"/>
-        </w:rPr>
-        <w:t>Conta bancaria da empresa</w:t>
-      </w:r>
-    </w:p>
-    <w:p>
-      <w:pPr>
-        <w:pStyle w:val="ListParagraph"/>
-        <w:numPr>
-          <w:ilvl w:val="0"/>
-          <w:numId w:val="1"/>
-        </w:numPr>
-        <w:spacing w:line="360" w:lineRule="auto"/>
-        <w:jc w:val="both"/>
-        <w:rPr>
-          <w:rFonts w:ascii="Times New Roman" w:hAnsi="Times New Roman" w:cs="Times New Roman"/>
-          <w:sz w:val="24"/>
-          <w:szCs w:val="24"/>
-        </w:rPr>
-      </w:pPr>
-      <w:r>
-        <w:rPr>
-          <w:rFonts w:ascii="Times New Roman" w:hAnsi="Times New Roman" w:cs="Times New Roman"/>
-          <w:sz w:val="24"/>
-          <w:szCs w:val="24"/>
-        </w:rPr>
-        <w:t>Endereço da empresa</w:t>
-      </w:r>
-    </w:p>
-    <w:p>
-      <w:pPr>
-        <w:pStyle w:val="ListParagraph"/>
-        <w:numPr>
-          <w:ilvl w:val="0"/>
-          <w:numId w:val="1"/>
-        </w:numPr>
-        <w:spacing w:line="360" w:lineRule="auto"/>
-        <w:jc w:val="both"/>
-        <w:rPr>
-          <w:rFonts w:ascii="Times New Roman" w:hAnsi="Times New Roman" w:cs="Times New Roman"/>
-          <w:sz w:val="24"/>
-          <w:szCs w:val="24"/>
-        </w:rPr>
-      </w:pPr>
-      <w:r>
-        <w:rPr>
-          <w:rFonts w:ascii="Times New Roman" w:hAnsi="Times New Roman" w:cs="Times New Roman"/>
-          <w:sz w:val="24"/>
-          <w:szCs w:val="24"/>
-        </w:rPr>
-        <w:t>Funcionário da empresa</w:t>
-      </w:r>
-    </w:p>
-    <w:p>
-      <w:pPr>
-        <w:spacing w:line="360" w:lineRule="auto"/>
-        <w:jc w:val="both"/>
-        <w:rPr>
-          <w:rFonts w:ascii="Times New Roman" w:hAnsi="Times New Roman" w:cs="Times New Roman"/>
-          <w:sz w:val="24"/>
-          <w:szCs w:val="24"/>
-        </w:rPr>
-      </w:pPr>
+        <w:t>Documentos comerciais</w:t>
+      </w:r>
+    </w:p>
+    <w:p>
+      <w:pPr>
+        <w:spacing w:line="360" w:lineRule="auto"/>
+        <w:jc w:val="both"/>
+        <w:rPr>
+          <w:rFonts w:ascii="Times New Roman" w:hAnsi="Times New Roman" w:cs="Times New Roman"/>
+          <w:sz w:val="24"/>
+          <w:szCs w:val="24"/>
+        </w:rPr>
+      </w:pPr>
+      <w:proofErr w:type="spellStart"/>
+      <w:r>
+        <w:rPr>
+          <w:rFonts w:ascii="Times New Roman" w:hAnsi="Times New Roman" w:cs="Times New Roman"/>
+          <w:sz w:val="24"/>
+          <w:szCs w:val="24"/>
+        </w:rPr>
+        <w:t>E</w:t>
+      </w:r>
+      <w:r>
+        <w:rPr>
+          <w:rFonts w:ascii="Times New Roman" w:hAnsi="Times New Roman" w:cs="Times New Roman"/>
+          <w:sz w:val="24"/>
+          <w:szCs w:val="24"/>
+        </w:rPr>
+        <w:t>bjfhg</w:t>
+      </w:r>
+      <w:proofErr w:type="spellEnd"/>
+      <w:r>
+        <w:rPr>
+          <w:rFonts w:ascii="Times New Roman" w:hAnsi="Times New Roman" w:cs="Times New Roman"/>
+          <w:sz w:val="24"/>
+          <w:szCs w:val="24"/>
+        </w:rPr>
+        <w:t xml:space="preserve"> </w:t>
+      </w:r>
+      <w:proofErr w:type="spellStart"/>
+      <w:r>
+        <w:rPr>
+          <w:rFonts w:ascii="Times New Roman" w:hAnsi="Times New Roman" w:cs="Times New Roman"/>
+          <w:sz w:val="24"/>
+          <w:szCs w:val="24"/>
+        </w:rPr>
+        <w:t>hjghjj</w:t>
+      </w:r>
+      <w:proofErr w:type="spellEnd"/>
+      <w:r>
+        <w:rPr>
+          <w:rFonts w:ascii="Times New Roman" w:hAnsi="Times New Roman" w:cs="Times New Roman"/>
+          <w:sz w:val="24"/>
+          <w:szCs w:val="24"/>
+        </w:rPr>
+        <w:t xml:space="preserve"> </w:t>
+      </w:r>
+      <w:proofErr w:type="spellStart"/>
+      <w:r>
+        <w:rPr>
+          <w:rFonts w:ascii="Times New Roman" w:hAnsi="Times New Roman" w:cs="Times New Roman"/>
+          <w:sz w:val="24"/>
+          <w:szCs w:val="24"/>
+        </w:rPr>
+        <w:t>hjffjf</w:t>
+      </w:r>
+      <w:proofErr w:type="spellEnd"/>
+      <w:r>
+        <w:rPr>
+          <w:rFonts w:ascii="Times New Roman" w:hAnsi="Times New Roman" w:cs="Times New Roman"/>
+          <w:sz w:val="24"/>
+          <w:szCs w:val="24"/>
+        </w:rPr>
+        <w:t xml:space="preserve"> </w:t>
+      </w:r>
+      <w:bookmarkStart w:id="0" w:name="_GoBack"/>
+      <w:bookmarkEnd w:id="0"/>
     </w:p>
     <w:sectPr>
       <w:pgSz w:w="11906" w:h="16838"/>
@@ -702,6 +1152,388 @@
 <file path=word/numbering.xml><?xml version="1.0" encoding="utf-8"?>
 <w:numbering xmlns:wpc="http://schemas.microsoft.com/office/word/2010/wordprocessingCanvas" xmlns:cx="http://schemas.microsoft.com/office/drawing/2014/chartex" xmlns:mc="http://schemas.openxmlformats.org/markup-compatibility/2006" xmlns:o="urn:schemas-microsoft-com:office:office" xmlns:r="http://schemas.openxmlformats.org/officeDocument/2006/relationships" xmlns:m="http://schemas.openxmlformats.org/officeDocument/2006/math" xmlns:v="urn:schemas-microsoft-com:vml" xmlns:wp14="http://schemas.microsoft.com/office/word/2010/wordprocessingDrawing" xmlns:wp="http://schemas.openxmlformats.org/drawingml/2006/wordprocessingDrawing" xmlns:w10="urn:schemas-microsoft-com:office:word" xmlns:w="http://schemas.openxmlformats.org/wordprocessingml/2006/main" xmlns:w14="http://schemas.microsoft.com/office/word/2010/wordml" xmlns:w15="http://schemas.microsoft.com/office/word/2012/wordml" xmlns:w16se="http://schemas.microsoft.com/office/word/2015/wordml/symex" xmlns:wpg="http://schemas.microsoft.com/office/word/2010/wordprocessingGroup" xmlns:wpi="http://schemas.microsoft.com/office/word/2010/wordprocessingInk" xmlns:wne="http://schemas.microsoft.com/office/word/2006/wordml" xmlns:wps="http://schemas.microsoft.com/office/word/2010/wordprocessingShape" mc:Ignorable="w14 w15 w16se wp14">
   <w:abstractNum w:abstractNumId="0" w15:restartNumberingAfterBreak="0">
+    <w:nsid w:val="089A320F"/>
+    <w:multiLevelType w:val="hybridMultilevel"/>
+    <w:tmpl w:val="6F4062DE"/>
+    <w:lvl w:ilvl="0" w:tplc="0409000F">
+      <w:start w:val="1"/>
+      <w:numFmt w:val="decimal"/>
+      <w:lvlText w:val="%1."/>
+      <w:lvlJc w:val="left"/>
+      <w:pPr>
+        <w:ind w:left="720" w:hanging="360"/>
+      </w:pPr>
+    </w:lvl>
+    <w:lvl w:ilvl="1" w:tplc="08160019" w:tentative="1">
+      <w:start w:val="1"/>
+      <w:numFmt w:val="lowerLetter"/>
+      <w:lvlText w:val="%2."/>
+      <w:lvlJc w:val="left"/>
+      <w:pPr>
+        <w:ind w:left="1440" w:hanging="360"/>
+      </w:pPr>
+    </w:lvl>
+    <w:lvl w:ilvl="2" w:tplc="0816001B" w:tentative="1">
+      <w:start w:val="1"/>
+      <w:numFmt w:val="lowerRoman"/>
+      <w:lvlText w:val="%3."/>
+      <w:lvlJc w:val="right"/>
+      <w:pPr>
+        <w:ind w:left="2160" w:hanging="180"/>
+      </w:pPr>
+    </w:lvl>
+    <w:lvl w:ilvl="3" w:tplc="0816000F" w:tentative="1">
+      <w:start w:val="1"/>
+      <w:numFmt w:val="decimal"/>
+      <w:lvlText w:val="%4."/>
+      <w:lvlJc w:val="left"/>
+      <w:pPr>
+        <w:ind w:left="2880" w:hanging="360"/>
+      </w:pPr>
+    </w:lvl>
+    <w:lvl w:ilvl="4" w:tplc="08160019" w:tentative="1">
+      <w:start w:val="1"/>
+      <w:numFmt w:val="lowerLetter"/>
+      <w:lvlText w:val="%5."/>
+      <w:lvlJc w:val="left"/>
+      <w:pPr>
+        <w:ind w:left="3600" w:hanging="360"/>
+      </w:pPr>
+    </w:lvl>
+    <w:lvl w:ilvl="5" w:tplc="0816001B" w:tentative="1">
+      <w:start w:val="1"/>
+      <w:numFmt w:val="lowerRoman"/>
+      <w:lvlText w:val="%6."/>
+      <w:lvlJc w:val="right"/>
+      <w:pPr>
+        <w:ind w:left="4320" w:hanging="180"/>
+      </w:pPr>
+    </w:lvl>
+    <w:lvl w:ilvl="6" w:tplc="0816000F" w:tentative="1">
+      <w:start w:val="1"/>
+      <w:numFmt w:val="decimal"/>
+      <w:lvlText w:val="%7."/>
+      <w:lvlJc w:val="left"/>
+      <w:pPr>
+        <w:ind w:left="5040" w:hanging="360"/>
+      </w:pPr>
+    </w:lvl>
+    <w:lvl w:ilvl="7" w:tplc="08160019" w:tentative="1">
+      <w:start w:val="1"/>
+      <w:numFmt w:val="lowerLetter"/>
+      <w:lvlText w:val="%8."/>
+      <w:lvlJc w:val="left"/>
+      <w:pPr>
+        <w:ind w:left="5760" w:hanging="360"/>
+      </w:pPr>
+    </w:lvl>
+    <w:lvl w:ilvl="8" w:tplc="0816001B" w:tentative="1">
+      <w:start w:val="1"/>
+      <w:numFmt w:val="lowerRoman"/>
+      <w:lvlText w:val="%9."/>
+      <w:lvlJc w:val="right"/>
+      <w:pPr>
+        <w:ind w:left="6480" w:hanging="180"/>
+      </w:pPr>
+    </w:lvl>
+  </w:abstractNum>
+  <w:abstractNum w:abstractNumId="1" w15:restartNumberingAfterBreak="0">
+    <w:nsid w:val="094B2A26"/>
+    <w:multiLevelType w:val="hybridMultilevel"/>
+    <w:tmpl w:val="673E1684"/>
+    <w:lvl w:ilvl="0" w:tplc="04090017">
+      <w:start w:val="1"/>
+      <w:numFmt w:val="lowerLetter"/>
+      <w:lvlText w:val="%1)"/>
+      <w:lvlJc w:val="left"/>
+      <w:pPr>
+        <w:ind w:left="1800" w:hanging="360"/>
+      </w:pPr>
+    </w:lvl>
+    <w:lvl w:ilvl="1" w:tplc="08160019" w:tentative="1">
+      <w:start w:val="1"/>
+      <w:numFmt w:val="lowerLetter"/>
+      <w:lvlText w:val="%2."/>
+      <w:lvlJc w:val="left"/>
+      <w:pPr>
+        <w:ind w:left="2520" w:hanging="360"/>
+      </w:pPr>
+    </w:lvl>
+    <w:lvl w:ilvl="2" w:tplc="0816001B" w:tentative="1">
+      <w:start w:val="1"/>
+      <w:numFmt w:val="lowerRoman"/>
+      <w:lvlText w:val="%3."/>
+      <w:lvlJc w:val="right"/>
+      <w:pPr>
+        <w:ind w:left="3240" w:hanging="180"/>
+      </w:pPr>
+    </w:lvl>
+    <w:lvl w:ilvl="3" w:tplc="0816000F" w:tentative="1">
+      <w:start w:val="1"/>
+      <w:numFmt w:val="decimal"/>
+      <w:lvlText w:val="%4."/>
+      <w:lvlJc w:val="left"/>
+      <w:pPr>
+        <w:ind w:left="3960" w:hanging="360"/>
+      </w:pPr>
+    </w:lvl>
+    <w:lvl w:ilvl="4" w:tplc="08160019" w:tentative="1">
+      <w:start w:val="1"/>
+      <w:numFmt w:val="lowerLetter"/>
+      <w:lvlText w:val="%5."/>
+      <w:lvlJc w:val="left"/>
+      <w:pPr>
+        <w:ind w:left="4680" w:hanging="360"/>
+      </w:pPr>
+    </w:lvl>
+    <w:lvl w:ilvl="5" w:tplc="0816001B" w:tentative="1">
+      <w:start w:val="1"/>
+      <w:numFmt w:val="lowerRoman"/>
+      <w:lvlText w:val="%6."/>
+      <w:lvlJc w:val="right"/>
+      <w:pPr>
+        <w:ind w:left="5400" w:hanging="180"/>
+      </w:pPr>
+    </w:lvl>
+    <w:lvl w:ilvl="6" w:tplc="0816000F" w:tentative="1">
+      <w:start w:val="1"/>
+      <w:numFmt w:val="decimal"/>
+      <w:lvlText w:val="%7."/>
+      <w:lvlJc w:val="left"/>
+      <w:pPr>
+        <w:ind w:left="6120" w:hanging="360"/>
+      </w:pPr>
+    </w:lvl>
+    <w:lvl w:ilvl="7" w:tplc="08160019" w:tentative="1">
+      <w:start w:val="1"/>
+      <w:numFmt w:val="lowerLetter"/>
+      <w:lvlText w:val="%8."/>
+      <w:lvlJc w:val="left"/>
+      <w:pPr>
+        <w:ind w:left="6840" w:hanging="360"/>
+      </w:pPr>
+    </w:lvl>
+    <w:lvl w:ilvl="8" w:tplc="0816001B" w:tentative="1">
+      <w:start w:val="1"/>
+      <w:numFmt w:val="lowerRoman"/>
+      <w:lvlText w:val="%9."/>
+      <w:lvlJc w:val="right"/>
+      <w:pPr>
+        <w:ind w:left="7560" w:hanging="180"/>
+      </w:pPr>
+    </w:lvl>
+  </w:abstractNum>
+  <w:abstractNum w:abstractNumId="2" w15:restartNumberingAfterBreak="0">
+    <w:nsid w:val="0AAA4AB1"/>
+    <w:multiLevelType w:val="multilevel"/>
+    <w:tmpl w:val="0EE253C0"/>
+    <w:lvl w:ilvl="0">
+      <w:start w:val="1"/>
+      <w:numFmt w:val="decimal"/>
+      <w:lvlText w:val="%1."/>
+      <w:lvlJc w:val="left"/>
+      <w:pPr>
+        <w:ind w:left="720" w:hanging="360"/>
+      </w:pPr>
+      <w:rPr>
+        <w:rFonts w:hint="default"/>
+        <w:b/>
+      </w:rPr>
+    </w:lvl>
+    <w:lvl w:ilvl="1">
+      <w:start w:val="1"/>
+      <w:numFmt w:val="decimal"/>
+      <w:isLgl/>
+      <w:lvlText w:val="%1.%2."/>
+      <w:lvlJc w:val="left"/>
+      <w:pPr>
+        <w:ind w:left="1080" w:hanging="360"/>
+      </w:pPr>
+      <w:rPr>
+        <w:rFonts w:hint="default"/>
+        <w:b/>
+      </w:rPr>
+    </w:lvl>
+    <w:lvl w:ilvl="2">
+      <w:start w:val="1"/>
+      <w:numFmt w:val="decimal"/>
+      <w:isLgl/>
+      <w:lvlText w:val="%1.%2.%3."/>
+      <w:lvlJc w:val="left"/>
+      <w:pPr>
+        <w:ind w:left="1800" w:hanging="720"/>
+      </w:pPr>
+      <w:rPr>
+        <w:rFonts w:hint="default"/>
+        <w:b/>
+      </w:rPr>
+    </w:lvl>
+    <w:lvl w:ilvl="3">
+      <w:start w:val="1"/>
+      <w:numFmt w:val="decimal"/>
+      <w:isLgl/>
+      <w:lvlText w:val="%1.%2.%3.%4."/>
+      <w:lvlJc w:val="left"/>
+      <w:pPr>
+        <w:ind w:left="2160" w:hanging="720"/>
+      </w:pPr>
+      <w:rPr>
+        <w:rFonts w:hint="default"/>
+      </w:rPr>
+    </w:lvl>
+    <w:lvl w:ilvl="4">
+      <w:start w:val="1"/>
+      <w:numFmt w:val="decimal"/>
+      <w:isLgl/>
+      <w:lvlText w:val="%1.%2.%3.%4.%5."/>
+      <w:lvlJc w:val="left"/>
+      <w:pPr>
+        <w:ind w:left="2880" w:hanging="1080"/>
+      </w:pPr>
+      <w:rPr>
+        <w:rFonts w:hint="default"/>
+      </w:rPr>
+    </w:lvl>
+    <w:lvl w:ilvl="5">
+      <w:start w:val="1"/>
+      <w:numFmt w:val="decimal"/>
+      <w:isLgl/>
+      <w:lvlText w:val="%1.%2.%3.%4.%5.%6."/>
+      <w:lvlJc w:val="left"/>
+      <w:pPr>
+        <w:ind w:left="3240" w:hanging="1080"/>
+      </w:pPr>
+      <w:rPr>
+        <w:rFonts w:hint="default"/>
+      </w:rPr>
+    </w:lvl>
+    <w:lvl w:ilvl="6">
+      <w:start w:val="1"/>
+      <w:numFmt w:val="decimal"/>
+      <w:isLgl/>
+      <w:lvlText w:val="%1.%2.%3.%4.%5.%6.%7."/>
+      <w:lvlJc w:val="left"/>
+      <w:pPr>
+        <w:ind w:left="3960" w:hanging="1440"/>
+      </w:pPr>
+      <w:rPr>
+        <w:rFonts w:hint="default"/>
+      </w:rPr>
+    </w:lvl>
+    <w:lvl w:ilvl="7">
+      <w:start w:val="1"/>
+      <w:numFmt w:val="decimal"/>
+      <w:isLgl/>
+      <w:lvlText w:val="%1.%2.%3.%4.%5.%6.%7.%8."/>
+      <w:lvlJc w:val="left"/>
+      <w:pPr>
+        <w:ind w:left="4320" w:hanging="1440"/>
+      </w:pPr>
+      <w:rPr>
+        <w:rFonts w:hint="default"/>
+      </w:rPr>
+    </w:lvl>
+    <w:lvl w:ilvl="8">
+      <w:start w:val="1"/>
+      <w:numFmt w:val="decimal"/>
+      <w:isLgl/>
+      <w:lvlText w:val="%1.%2.%3.%4.%5.%6.%7.%8.%9."/>
+      <w:lvlJc w:val="left"/>
+      <w:pPr>
+        <w:ind w:left="5040" w:hanging="1800"/>
+      </w:pPr>
+      <w:rPr>
+        <w:rFonts w:hint="default"/>
+      </w:rPr>
+    </w:lvl>
+  </w:abstractNum>
+  <w:abstractNum w:abstractNumId="3" w15:restartNumberingAfterBreak="0">
+    <w:nsid w:val="32C91206"/>
+    <w:multiLevelType w:val="hybridMultilevel"/>
+    <w:tmpl w:val="63B0D170"/>
+    <w:lvl w:ilvl="0" w:tplc="04090017">
+      <w:start w:val="1"/>
+      <w:numFmt w:val="lowerLetter"/>
+      <w:lvlText w:val="%1)"/>
+      <w:lvlJc w:val="left"/>
+      <w:pPr>
+        <w:ind w:left="2520" w:hanging="360"/>
+      </w:pPr>
+    </w:lvl>
+    <w:lvl w:ilvl="1" w:tplc="08160019" w:tentative="1">
+      <w:start w:val="1"/>
+      <w:numFmt w:val="lowerLetter"/>
+      <w:lvlText w:val="%2."/>
+      <w:lvlJc w:val="left"/>
+      <w:pPr>
+        <w:ind w:left="3240" w:hanging="360"/>
+      </w:pPr>
+    </w:lvl>
+    <w:lvl w:ilvl="2" w:tplc="0816001B" w:tentative="1">
+      <w:start w:val="1"/>
+      <w:numFmt w:val="lowerRoman"/>
+      <w:lvlText w:val="%3."/>
+      <w:lvlJc w:val="right"/>
+      <w:pPr>
+        <w:ind w:left="3960" w:hanging="180"/>
+      </w:pPr>
+    </w:lvl>
+    <w:lvl w:ilvl="3" w:tplc="0816000F" w:tentative="1">
+      <w:start w:val="1"/>
+      <w:numFmt w:val="decimal"/>
+      <w:lvlText w:val="%4."/>
+      <w:lvlJc w:val="left"/>
+      <w:pPr>
+        <w:ind w:left="4680" w:hanging="360"/>
+      </w:pPr>
+    </w:lvl>
+    <w:lvl w:ilvl="4" w:tplc="08160019" w:tentative="1">
+      <w:start w:val="1"/>
+      <w:numFmt w:val="lowerLetter"/>
+      <w:lvlText w:val="%5."/>
+      <w:lvlJc w:val="left"/>
+      <w:pPr>
+        <w:ind w:left="5400" w:hanging="360"/>
+      </w:pPr>
+    </w:lvl>
+    <w:lvl w:ilvl="5" w:tplc="0816001B" w:tentative="1">
+      <w:start w:val="1"/>
+      <w:numFmt w:val="lowerRoman"/>
+      <w:lvlText w:val="%6."/>
+      <w:lvlJc w:val="right"/>
+      <w:pPr>
+        <w:ind w:left="6120" w:hanging="180"/>
+      </w:pPr>
+    </w:lvl>
+    <w:lvl w:ilvl="6" w:tplc="0816000F" w:tentative="1">
+      <w:start w:val="1"/>
+      <w:numFmt w:val="decimal"/>
+      <w:lvlText w:val="%7."/>
+      <w:lvlJc w:val="left"/>
+      <w:pPr>
+        <w:ind w:left="6840" w:hanging="360"/>
+      </w:pPr>
+    </w:lvl>
+    <w:lvl w:ilvl="7" w:tplc="08160019" w:tentative="1">
+      <w:start w:val="1"/>
+      <w:numFmt w:val="lowerLetter"/>
+      <w:lvlText w:val="%8."/>
+      <w:lvlJc w:val="left"/>
+      <w:pPr>
+        <w:ind w:left="7560" w:hanging="360"/>
+      </w:pPr>
+    </w:lvl>
+    <w:lvl w:ilvl="8" w:tplc="0816001B" w:tentative="1">
+      <w:start w:val="1"/>
+      <w:numFmt w:val="lowerRoman"/>
+      <w:lvlText w:val="%9."/>
+      <w:lvlJc w:val="right"/>
+      <w:pPr>
+        <w:ind w:left="8280" w:hanging="180"/>
+      </w:pPr>
+    </w:lvl>
+  </w:abstractNum>
+  <w:abstractNum w:abstractNumId="4" w15:restartNumberingAfterBreak="0">
     <w:nsid w:val="342B189B"/>
     <w:multiLevelType w:val="hybridMultilevel"/>
     <w:tmpl w:val="CAFCDA9E"/>
@@ -790,8 +1622,353 @@
       </w:pPr>
     </w:lvl>
   </w:abstractNum>
+  <w:abstractNum w:abstractNumId="5" w15:restartNumberingAfterBreak="0">
+    <w:nsid w:val="34B12FD5"/>
+    <w:multiLevelType w:val="hybridMultilevel"/>
+    <w:tmpl w:val="CD220A06"/>
+    <w:lvl w:ilvl="0" w:tplc="49C68B48">
+      <w:start w:val="1"/>
+      <w:numFmt w:val="decimal"/>
+      <w:lvlText w:val="%1."/>
+      <w:lvlJc w:val="left"/>
+      <w:pPr>
+        <w:ind w:left="1080" w:hanging="360"/>
+      </w:pPr>
+      <w:rPr>
+        <w:rFonts w:hint="default"/>
+      </w:rPr>
+    </w:lvl>
+    <w:lvl w:ilvl="1" w:tplc="08160019" w:tentative="1">
+      <w:start w:val="1"/>
+      <w:numFmt w:val="lowerLetter"/>
+      <w:lvlText w:val="%2."/>
+      <w:lvlJc w:val="left"/>
+      <w:pPr>
+        <w:ind w:left="1800" w:hanging="360"/>
+      </w:pPr>
+    </w:lvl>
+    <w:lvl w:ilvl="2" w:tplc="0816001B" w:tentative="1">
+      <w:start w:val="1"/>
+      <w:numFmt w:val="lowerRoman"/>
+      <w:lvlText w:val="%3."/>
+      <w:lvlJc w:val="right"/>
+      <w:pPr>
+        <w:ind w:left="2520" w:hanging="180"/>
+      </w:pPr>
+    </w:lvl>
+    <w:lvl w:ilvl="3" w:tplc="0816000F" w:tentative="1">
+      <w:start w:val="1"/>
+      <w:numFmt w:val="decimal"/>
+      <w:lvlText w:val="%4."/>
+      <w:lvlJc w:val="left"/>
+      <w:pPr>
+        <w:ind w:left="3240" w:hanging="360"/>
+      </w:pPr>
+    </w:lvl>
+    <w:lvl w:ilvl="4" w:tplc="08160019" w:tentative="1">
+      <w:start w:val="1"/>
+      <w:numFmt w:val="lowerLetter"/>
+      <w:lvlText w:val="%5."/>
+      <w:lvlJc w:val="left"/>
+      <w:pPr>
+        <w:ind w:left="3960" w:hanging="360"/>
+      </w:pPr>
+    </w:lvl>
+    <w:lvl w:ilvl="5" w:tplc="0816001B" w:tentative="1">
+      <w:start w:val="1"/>
+      <w:numFmt w:val="lowerRoman"/>
+      <w:lvlText w:val="%6."/>
+      <w:lvlJc w:val="right"/>
+      <w:pPr>
+        <w:ind w:left="4680" w:hanging="180"/>
+      </w:pPr>
+    </w:lvl>
+    <w:lvl w:ilvl="6" w:tplc="0816000F" w:tentative="1">
+      <w:start w:val="1"/>
+      <w:numFmt w:val="decimal"/>
+      <w:lvlText w:val="%7."/>
+      <w:lvlJc w:val="left"/>
+      <w:pPr>
+        <w:ind w:left="5400" w:hanging="360"/>
+      </w:pPr>
+    </w:lvl>
+    <w:lvl w:ilvl="7" w:tplc="08160019" w:tentative="1">
+      <w:start w:val="1"/>
+      <w:numFmt w:val="lowerLetter"/>
+      <w:lvlText w:val="%8."/>
+      <w:lvlJc w:val="left"/>
+      <w:pPr>
+        <w:ind w:left="6120" w:hanging="360"/>
+      </w:pPr>
+    </w:lvl>
+    <w:lvl w:ilvl="8" w:tplc="0816001B" w:tentative="1">
+      <w:start w:val="1"/>
+      <w:numFmt w:val="lowerRoman"/>
+      <w:lvlText w:val="%9."/>
+      <w:lvlJc w:val="right"/>
+      <w:pPr>
+        <w:ind w:left="6840" w:hanging="180"/>
+      </w:pPr>
+    </w:lvl>
+  </w:abstractNum>
+  <w:abstractNum w:abstractNumId="6" w15:restartNumberingAfterBreak="0">
+    <w:nsid w:val="395074FD"/>
+    <w:multiLevelType w:val="hybridMultilevel"/>
+    <w:tmpl w:val="D5CE00DC"/>
+    <w:lvl w:ilvl="0" w:tplc="0409000F">
+      <w:start w:val="1"/>
+      <w:numFmt w:val="decimal"/>
+      <w:lvlText w:val="%1."/>
+      <w:lvlJc w:val="left"/>
+      <w:pPr>
+        <w:ind w:left="1440" w:hanging="360"/>
+      </w:pPr>
+    </w:lvl>
+    <w:lvl w:ilvl="1" w:tplc="08160019" w:tentative="1">
+      <w:start w:val="1"/>
+      <w:numFmt w:val="lowerLetter"/>
+      <w:lvlText w:val="%2."/>
+      <w:lvlJc w:val="left"/>
+      <w:pPr>
+        <w:ind w:left="2160" w:hanging="360"/>
+      </w:pPr>
+    </w:lvl>
+    <w:lvl w:ilvl="2" w:tplc="0816001B" w:tentative="1">
+      <w:start w:val="1"/>
+      <w:numFmt w:val="lowerRoman"/>
+      <w:lvlText w:val="%3."/>
+      <w:lvlJc w:val="right"/>
+      <w:pPr>
+        <w:ind w:left="2880" w:hanging="180"/>
+      </w:pPr>
+    </w:lvl>
+    <w:lvl w:ilvl="3" w:tplc="0816000F" w:tentative="1">
+      <w:start w:val="1"/>
+      <w:numFmt w:val="decimal"/>
+      <w:lvlText w:val="%4."/>
+      <w:lvlJc w:val="left"/>
+      <w:pPr>
+        <w:ind w:left="3600" w:hanging="360"/>
+      </w:pPr>
+    </w:lvl>
+    <w:lvl w:ilvl="4" w:tplc="08160019" w:tentative="1">
+      <w:start w:val="1"/>
+      <w:numFmt w:val="lowerLetter"/>
+      <w:lvlText w:val="%5."/>
+      <w:lvlJc w:val="left"/>
+      <w:pPr>
+        <w:ind w:left="4320" w:hanging="360"/>
+      </w:pPr>
+    </w:lvl>
+    <w:lvl w:ilvl="5" w:tplc="0816001B" w:tentative="1">
+      <w:start w:val="1"/>
+      <w:numFmt w:val="lowerRoman"/>
+      <w:lvlText w:val="%6."/>
+      <w:lvlJc w:val="right"/>
+      <w:pPr>
+        <w:ind w:left="5040" w:hanging="180"/>
+      </w:pPr>
+    </w:lvl>
+    <w:lvl w:ilvl="6" w:tplc="0816000F" w:tentative="1">
+      <w:start w:val="1"/>
+      <w:numFmt w:val="decimal"/>
+      <w:lvlText w:val="%7."/>
+      <w:lvlJc w:val="left"/>
+      <w:pPr>
+        <w:ind w:left="5760" w:hanging="360"/>
+      </w:pPr>
+    </w:lvl>
+    <w:lvl w:ilvl="7" w:tplc="08160019" w:tentative="1">
+      <w:start w:val="1"/>
+      <w:numFmt w:val="lowerLetter"/>
+      <w:lvlText w:val="%8."/>
+      <w:lvlJc w:val="left"/>
+      <w:pPr>
+        <w:ind w:left="6480" w:hanging="360"/>
+      </w:pPr>
+    </w:lvl>
+    <w:lvl w:ilvl="8" w:tplc="0816001B" w:tentative="1">
+      <w:start w:val="1"/>
+      <w:numFmt w:val="lowerRoman"/>
+      <w:lvlText w:val="%9."/>
+      <w:lvlJc w:val="right"/>
+      <w:pPr>
+        <w:ind w:left="7200" w:hanging="180"/>
+      </w:pPr>
+    </w:lvl>
+  </w:abstractNum>
+  <w:abstractNum w:abstractNumId="7" w15:restartNumberingAfterBreak="0">
+    <w:nsid w:val="76614557"/>
+    <w:multiLevelType w:val="multilevel"/>
+    <w:tmpl w:val="9CE8EC6E"/>
+    <w:lvl w:ilvl="0">
+      <w:start w:val="1"/>
+      <w:numFmt w:val="bullet"/>
+      <w:lvlText w:val=""/>
+      <w:lvlJc w:val="left"/>
+      <w:pPr>
+        <w:tabs>
+          <w:tab w:val="num" w:pos="720"/>
+        </w:tabs>
+        <w:ind w:left="720" w:hanging="360"/>
+      </w:pPr>
+      <w:rPr>
+        <w:rFonts w:ascii="Symbol" w:hAnsi="Symbol" w:hint="default"/>
+        <w:sz w:val="20"/>
+      </w:rPr>
+    </w:lvl>
+    <w:lvl w:ilvl="1" w:tentative="1">
+      <w:start w:val="1"/>
+      <w:numFmt w:val="bullet"/>
+      <w:lvlText w:val="o"/>
+      <w:lvlJc w:val="left"/>
+      <w:pPr>
+        <w:tabs>
+          <w:tab w:val="num" w:pos="1440"/>
+        </w:tabs>
+        <w:ind w:left="1440" w:hanging="360"/>
+      </w:pPr>
+      <w:rPr>
+        <w:rFonts w:ascii="Courier New" w:hAnsi="Courier New" w:hint="default"/>
+        <w:sz w:val="20"/>
+      </w:rPr>
+    </w:lvl>
+    <w:lvl w:ilvl="2" w:tentative="1">
+      <w:start w:val="1"/>
+      <w:numFmt w:val="bullet"/>
+      <w:lvlText w:val=""/>
+      <w:lvlJc w:val="left"/>
+      <w:pPr>
+        <w:tabs>
+          <w:tab w:val="num" w:pos="2160"/>
+        </w:tabs>
+        <w:ind w:left="2160" w:hanging="360"/>
+      </w:pPr>
+      <w:rPr>
+        <w:rFonts w:ascii="Wingdings" w:hAnsi="Wingdings" w:hint="default"/>
+        <w:sz w:val="20"/>
+      </w:rPr>
+    </w:lvl>
+    <w:lvl w:ilvl="3" w:tentative="1">
+      <w:start w:val="1"/>
+      <w:numFmt w:val="bullet"/>
+      <w:lvlText w:val=""/>
+      <w:lvlJc w:val="left"/>
+      <w:pPr>
+        <w:tabs>
+          <w:tab w:val="num" w:pos="2880"/>
+        </w:tabs>
+        <w:ind w:left="2880" w:hanging="360"/>
+      </w:pPr>
+      <w:rPr>
+        <w:rFonts w:ascii="Wingdings" w:hAnsi="Wingdings" w:hint="default"/>
+        <w:sz w:val="20"/>
+      </w:rPr>
+    </w:lvl>
+    <w:lvl w:ilvl="4" w:tentative="1">
+      <w:start w:val="1"/>
+      <w:numFmt w:val="bullet"/>
+      <w:lvlText w:val=""/>
+      <w:lvlJc w:val="left"/>
+      <w:pPr>
+        <w:tabs>
+          <w:tab w:val="num" w:pos="3600"/>
+        </w:tabs>
+        <w:ind w:left="3600" w:hanging="360"/>
+      </w:pPr>
+      <w:rPr>
+        <w:rFonts w:ascii="Wingdings" w:hAnsi="Wingdings" w:hint="default"/>
+        <w:sz w:val="20"/>
+      </w:rPr>
+    </w:lvl>
+    <w:lvl w:ilvl="5" w:tentative="1">
+      <w:start w:val="1"/>
+      <w:numFmt w:val="bullet"/>
+      <w:lvlText w:val=""/>
+      <w:lvlJc w:val="left"/>
+      <w:pPr>
+        <w:tabs>
+          <w:tab w:val="num" w:pos="4320"/>
+        </w:tabs>
+        <w:ind w:left="4320" w:hanging="360"/>
+      </w:pPr>
+      <w:rPr>
+        <w:rFonts w:ascii="Wingdings" w:hAnsi="Wingdings" w:hint="default"/>
+        <w:sz w:val="20"/>
+      </w:rPr>
+    </w:lvl>
+    <w:lvl w:ilvl="6" w:tentative="1">
+      <w:start w:val="1"/>
+      <w:numFmt w:val="bullet"/>
+      <w:lvlText w:val=""/>
+      <w:lvlJc w:val="left"/>
+      <w:pPr>
+        <w:tabs>
+          <w:tab w:val="num" w:pos="5040"/>
+        </w:tabs>
+        <w:ind w:left="5040" w:hanging="360"/>
+      </w:pPr>
+      <w:rPr>
+        <w:rFonts w:ascii="Wingdings" w:hAnsi="Wingdings" w:hint="default"/>
+        <w:sz w:val="20"/>
+      </w:rPr>
+    </w:lvl>
+    <w:lvl w:ilvl="7" w:tentative="1">
+      <w:start w:val="1"/>
+      <w:numFmt w:val="bullet"/>
+      <w:lvlText w:val=""/>
+      <w:lvlJc w:val="left"/>
+      <w:pPr>
+        <w:tabs>
+          <w:tab w:val="num" w:pos="5760"/>
+        </w:tabs>
+        <w:ind w:left="5760" w:hanging="360"/>
+      </w:pPr>
+      <w:rPr>
+        <w:rFonts w:ascii="Wingdings" w:hAnsi="Wingdings" w:hint="default"/>
+        <w:sz w:val="20"/>
+      </w:rPr>
+    </w:lvl>
+    <w:lvl w:ilvl="8" w:tentative="1">
+      <w:start w:val="1"/>
+      <w:numFmt w:val="bullet"/>
+      <w:lvlText w:val=""/>
+      <w:lvlJc w:val="left"/>
+      <w:pPr>
+        <w:tabs>
+          <w:tab w:val="num" w:pos="6480"/>
+        </w:tabs>
+        <w:ind w:left="6480" w:hanging="360"/>
+      </w:pPr>
+      <w:rPr>
+        <w:rFonts w:ascii="Wingdings" w:hAnsi="Wingdings" w:hint="default"/>
+        <w:sz w:val="20"/>
+      </w:rPr>
+    </w:lvl>
+  </w:abstractNum>
   <w:num w:numId="1">
+    <w:abstractNumId w:val="4"/>
+  </w:num>
+  <w:num w:numId="2">
+    <w:abstractNumId w:val="7"/>
+  </w:num>
+  <w:num w:numId="3">
+    <w:abstractNumId w:val="2"/>
+  </w:num>
+  <w:num w:numId="4">
+    <w:abstractNumId w:val="5"/>
+  </w:num>
+  <w:num w:numId="5">
     <w:abstractNumId w:val="0"/>
+  </w:num>
+  <w:num w:numId="6">
+    <w:abstractNumId w:val="6"/>
+  </w:num>
+  <w:num w:numId="7">
+    <w:abstractNumId w:val="3"/>
+  </w:num>
+  <w:num w:numId="8">
+    <w:abstractNumId w:val="1"/>
   </w:num>
 </w:numbering>
 </file>

</xml_diff>

<commit_message>
reajuste do procedimento procedure_updateSaldoFactura_com_Atraso_de_Parcela
</commit_message>
<xml_diff>
--- a/Projecto I - Modelagem de Dados.docx
+++ b/Projecto I - Modelagem de Dados.docx
@@ -1,6 +1,6 @@
 
 <file path=word/document.xml><?xml version="1.0" encoding="utf-8"?>
-<w:document xmlns:wpc="http://schemas.microsoft.com/office/word/2010/wordprocessingCanvas" xmlns:cx="http://schemas.microsoft.com/office/drawing/2014/chartex" xmlns:mc="http://schemas.openxmlformats.org/markup-compatibility/2006" xmlns:o="urn:schemas-microsoft-com:office:office" xmlns:r="http://schemas.openxmlformats.org/officeDocument/2006/relationships" xmlns:m="http://schemas.openxmlformats.org/officeDocument/2006/math" xmlns:v="urn:schemas-microsoft-com:vml" xmlns:wp14="http://schemas.microsoft.com/office/word/2010/wordprocessingDrawing" xmlns:wp="http://schemas.openxmlformats.org/drawingml/2006/wordprocessingDrawing" xmlns:w10="urn:schemas-microsoft-com:office:word" xmlns:w="http://schemas.openxmlformats.org/wordprocessingml/2006/main" xmlns:w14="http://schemas.microsoft.com/office/word/2010/wordml" xmlns:w15="http://schemas.microsoft.com/office/word/2012/wordml" xmlns:w16se="http://schemas.microsoft.com/office/word/2015/wordml/symex" xmlns:wpg="http://schemas.microsoft.com/office/word/2010/wordprocessingGroup" xmlns:wpi="http://schemas.microsoft.com/office/word/2010/wordprocessingInk" xmlns:wne="http://schemas.microsoft.com/office/word/2006/wordml" xmlns:wps="http://schemas.microsoft.com/office/word/2010/wordprocessingShape" mc:Ignorable="w14 w15 w16se wp14">
+<w:document xmlns:wpc="http://schemas.microsoft.com/office/word/2010/wordprocessingCanvas" xmlns:cx="http://schemas.microsoft.com/office/drawing/2014/chartex" xmlns:cx1="http://schemas.microsoft.com/office/drawing/2015/9/8/chartex" xmlns:cx2="http://schemas.microsoft.com/office/drawing/2015/10/21/chartex" xmlns:cx3="http://schemas.microsoft.com/office/drawing/2016/5/9/chartex" xmlns:cx4="http://schemas.microsoft.com/office/drawing/2016/5/10/chartex" xmlns:cx5="http://schemas.microsoft.com/office/drawing/2016/5/11/chartex" xmlns:cx6="http://schemas.microsoft.com/office/drawing/2016/5/12/chartex" xmlns:cx7="http://schemas.microsoft.com/office/drawing/2016/5/13/chartex" xmlns:cx8="http://schemas.microsoft.com/office/drawing/2016/5/14/chartex" xmlns:mc="http://schemas.openxmlformats.org/markup-compatibility/2006" xmlns:aink="http://schemas.microsoft.com/office/drawing/2016/ink" xmlns:am3d="http://schemas.microsoft.com/office/drawing/2017/model3d" xmlns:o="urn:schemas-microsoft-com:office:office" xmlns:oel="http://schemas.microsoft.com/office/2019/extlst" xmlns:r="http://schemas.openxmlformats.org/officeDocument/2006/relationships" xmlns:m="http://schemas.openxmlformats.org/officeDocument/2006/math" xmlns:v="urn:schemas-microsoft-com:vml" xmlns:wp14="http://schemas.microsoft.com/office/word/2010/wordprocessingDrawing" xmlns:wp="http://schemas.openxmlformats.org/drawingml/2006/wordprocessingDrawing" xmlns:w10="urn:schemas-microsoft-com:office:word" xmlns:w="http://schemas.openxmlformats.org/wordprocessingml/2006/main" xmlns:w14="http://schemas.microsoft.com/office/word/2010/wordml" xmlns:w15="http://schemas.microsoft.com/office/word/2012/wordml" xmlns:w16cex="http://schemas.microsoft.com/office/word/2018/wordml/cex" xmlns:w16cid="http://schemas.microsoft.com/office/word/2016/wordml/cid" xmlns:w16="http://schemas.microsoft.com/office/word/2018/wordml" xmlns:w16du="http://schemas.microsoft.com/office/word/2023/wordml/word16du" xmlns:w16sdtdh="http://schemas.microsoft.com/office/word/2020/wordml/sdtdatahash" xmlns:w16se="http://schemas.microsoft.com/office/word/2015/wordml/symex" xmlns:wpg="http://schemas.microsoft.com/office/word/2010/wordprocessingGroup" xmlns:wpi="http://schemas.microsoft.com/office/word/2010/wordprocessingInk" xmlns:wne="http://schemas.microsoft.com/office/word/2006/wordml" xmlns:wps="http://schemas.microsoft.com/office/word/2010/wordprocessingShape" mc:Ignorable="w14 w15 w16se w16cid w16 w16cex w16sdtdh w16du wp14">
   <w:body>
     <w:p>
       <w:pPr>
@@ -113,12 +113,37 @@
           <w:sz w:val="24"/>
           <w:szCs w:val="24"/>
         </w:rPr>
-        <w:t xml:space="preserve">JM&amp;ISC – </w:t>
+        <w:t>JM</w:t>
+      </w:r>
+      <w:r>
+        <w:rPr>
+          <w:rFonts w:ascii="Times New Roman" w:hAnsi="Times New Roman" w:cs="Times New Roman"/>
+          <w:sz w:val="24"/>
+          <w:szCs w:val="24"/>
+        </w:rPr>
+        <w:t>-</w:t>
       </w:r>
       <w:proofErr w:type="spellStart"/>
       <w:r>
         <w:rPr>
           <w:rFonts w:ascii="Times New Roman" w:hAnsi="Times New Roman" w:cs="Times New Roman"/>
+          <w:sz w:val="24"/>
+          <w:szCs w:val="24"/>
+        </w:rPr>
+        <w:t>InvSM</w:t>
+      </w:r>
+      <w:proofErr w:type="spellEnd"/>
+      <w:r>
+        <w:rPr>
+          <w:rFonts w:ascii="Times New Roman" w:hAnsi="Times New Roman" w:cs="Times New Roman"/>
+          <w:sz w:val="24"/>
+          <w:szCs w:val="24"/>
+        </w:rPr>
+        <w:t xml:space="preserve"> – </w:t>
+      </w:r>
+      <w:r>
+        <w:rPr>
+          <w:rFonts w:ascii="Times New Roman" w:hAnsi="Times New Roman" w:cs="Times New Roman"/>
           <w:b/>
           <w:sz w:val="24"/>
           <w:szCs w:val="24"/>
@@ -128,10 +153,54 @@
       <w:r>
         <w:rPr>
           <w:rFonts w:ascii="Times New Roman" w:hAnsi="Times New Roman" w:cs="Times New Roman"/>
-          <w:sz w:val="24"/>
-          <w:szCs w:val="24"/>
-        </w:rPr>
-        <w:t>oin</w:t>
+          <w:b/>
+          <w:bCs/>
+          <w:sz w:val="24"/>
+          <w:szCs w:val="24"/>
+        </w:rPr>
+        <w:t>M</w:t>
+      </w:r>
+      <w:r>
+        <w:rPr>
+          <w:rFonts w:ascii="Times New Roman" w:hAnsi="Times New Roman" w:cs="Times New Roman"/>
+          <w:sz w:val="24"/>
+          <w:szCs w:val="24"/>
+        </w:rPr>
+        <w:t xml:space="preserve"> </w:t>
+      </w:r>
+      <w:r>
+        <w:rPr>
+          <w:rFonts w:ascii="Times New Roman" w:hAnsi="Times New Roman" w:cs="Times New Roman"/>
+          <w:sz w:val="24"/>
+          <w:szCs w:val="24"/>
+        </w:rPr>
+        <w:t>&amp;</w:t>
+      </w:r>
+      <w:r>
+        <w:rPr>
+          <w:rFonts w:ascii="Times New Roman" w:hAnsi="Times New Roman" w:cs="Times New Roman"/>
+          <w:sz w:val="24"/>
+          <w:szCs w:val="24"/>
+        </w:rPr>
+        <w:t xml:space="preserve"> </w:t>
+      </w:r>
+      <w:proofErr w:type="spellStart"/>
+      <w:r>
+        <w:rPr>
+          <w:rFonts w:ascii="Times New Roman" w:hAnsi="Times New Roman" w:cs="Times New Roman"/>
+          <w:b/>
+          <w:sz w:val="24"/>
+          <w:szCs w:val="24"/>
+        </w:rPr>
+        <w:t>I</w:t>
+      </w:r>
+      <w:r>
+        <w:rPr>
+          <w:rFonts w:ascii="Times New Roman" w:hAnsi="Times New Roman" w:cs="Times New Roman"/>
+          <w:sz w:val="24"/>
+          <w:szCs w:val="24"/>
+        </w:rPr>
+        <w:t>nvoice</w:t>
       </w:r>
       <w:proofErr w:type="spellEnd"/>
       <w:r>
@@ -142,6 +211,24 @@
         </w:rPr>
         <w:t xml:space="preserve"> </w:t>
       </w:r>
+      <w:proofErr w:type="spellStart"/>
+      <w:r>
+        <w:rPr>
+          <w:rFonts w:ascii="Times New Roman" w:hAnsi="Times New Roman" w:cs="Times New Roman"/>
+          <w:sz w:val="24"/>
+          <w:szCs w:val="24"/>
+        </w:rPr>
+        <w:t>and</w:t>
+      </w:r>
+      <w:proofErr w:type="spellEnd"/>
+      <w:r>
+        <w:rPr>
+          <w:rFonts w:ascii="Times New Roman" w:hAnsi="Times New Roman" w:cs="Times New Roman"/>
+          <w:sz w:val="24"/>
+          <w:szCs w:val="24"/>
+        </w:rPr>
+        <w:t xml:space="preserve"> </w:t>
+      </w:r>
       <w:r>
         <w:rPr>
           <w:rFonts w:ascii="Times New Roman" w:hAnsi="Times New Roman" w:cs="Times New Roman"/>
@@ -149,6 +236,24 @@
           <w:sz w:val="24"/>
           <w:szCs w:val="24"/>
         </w:rPr>
+        <w:t>S</w:t>
+      </w:r>
+      <w:r>
+        <w:rPr>
+          <w:rFonts w:ascii="Times New Roman" w:hAnsi="Times New Roman" w:cs="Times New Roman"/>
+          <w:sz w:val="24"/>
+          <w:szCs w:val="24"/>
+        </w:rPr>
+        <w:t xml:space="preserve">tock </w:t>
+      </w:r>
+      <w:r>
+        <w:rPr>
+          <w:rFonts w:ascii="Times New Roman" w:hAnsi="Times New Roman" w:cs="Times New Roman"/>
+          <w:b/>
+          <w:bCs/>
+          <w:sz w:val="24"/>
+          <w:szCs w:val="24"/>
+        </w:rPr>
         <w:t>M</w:t>
       </w:r>
       <w:r>
@@ -157,97 +262,8 @@
           <w:sz w:val="24"/>
           <w:szCs w:val="24"/>
         </w:rPr>
-        <w:t xml:space="preserve">anagement </w:t>
-      </w:r>
-      <w:r>
-        <w:rPr>
-          <w:rFonts w:ascii="Times New Roman" w:hAnsi="Times New Roman" w:cs="Times New Roman"/>
-          <w:sz w:val="24"/>
-          <w:szCs w:val="24"/>
-        </w:rPr>
-        <w:t>&amp;</w:t>
-      </w:r>
-      <w:r>
-        <w:rPr>
-          <w:rFonts w:ascii="Times New Roman" w:hAnsi="Times New Roman" w:cs="Times New Roman"/>
-          <w:sz w:val="24"/>
-          <w:szCs w:val="24"/>
-        </w:rPr>
-        <w:t xml:space="preserve"> </w:t>
-      </w:r>
-      <w:proofErr w:type="spellStart"/>
-      <w:r>
-        <w:rPr>
-          <w:rFonts w:ascii="Times New Roman" w:hAnsi="Times New Roman" w:cs="Times New Roman"/>
-          <w:b/>
-          <w:sz w:val="24"/>
-          <w:szCs w:val="24"/>
-        </w:rPr>
-        <w:t>I</w:t>
-      </w:r>
-      <w:r>
-        <w:rPr>
-          <w:rFonts w:ascii="Times New Roman" w:hAnsi="Times New Roman" w:cs="Times New Roman"/>
-          <w:sz w:val="24"/>
-          <w:szCs w:val="24"/>
-        </w:rPr>
-        <w:t>nvoice</w:t>
-      </w:r>
-      <w:proofErr w:type="spellEnd"/>
-      <w:r>
-        <w:rPr>
-          <w:rFonts w:ascii="Times New Roman" w:hAnsi="Times New Roman" w:cs="Times New Roman"/>
-          <w:sz w:val="24"/>
-          <w:szCs w:val="24"/>
-        </w:rPr>
-        <w:t xml:space="preserve"> </w:t>
-      </w:r>
-      <w:proofErr w:type="spellStart"/>
-      <w:r>
-        <w:rPr>
-          <w:rFonts w:ascii="Times New Roman" w:hAnsi="Times New Roman" w:cs="Times New Roman"/>
-          <w:b/>
-          <w:sz w:val="24"/>
-          <w:szCs w:val="24"/>
-        </w:rPr>
-        <w:t>S</w:t>
-      </w:r>
-      <w:r>
-        <w:rPr>
-          <w:rFonts w:ascii="Times New Roman" w:hAnsi="Times New Roman" w:cs="Times New Roman"/>
-          <w:sz w:val="24"/>
-          <w:szCs w:val="24"/>
-        </w:rPr>
-        <w:t>torage</w:t>
-      </w:r>
-      <w:proofErr w:type="spellEnd"/>
-      <w:r>
-        <w:rPr>
-          <w:rFonts w:ascii="Times New Roman" w:hAnsi="Times New Roman" w:cs="Times New Roman"/>
-          <w:sz w:val="24"/>
-          <w:szCs w:val="24"/>
-        </w:rPr>
-        <w:t xml:space="preserve"> </w:t>
-      </w:r>
-      <w:proofErr w:type="spellStart"/>
-      <w:r>
-        <w:rPr>
-          <w:rFonts w:ascii="Times New Roman" w:hAnsi="Times New Roman" w:cs="Times New Roman"/>
-          <w:b/>
-          <w:sz w:val="24"/>
-          <w:szCs w:val="24"/>
-        </w:rPr>
-        <w:t>C</w:t>
-      </w:r>
-      <w:r>
-        <w:rPr>
-          <w:rFonts w:ascii="Times New Roman" w:hAnsi="Times New Roman" w:cs="Times New Roman"/>
-          <w:sz w:val="24"/>
-          <w:szCs w:val="24"/>
-        </w:rPr>
-        <w:t>ontrol</w:t>
-      </w:r>
-      <w:proofErr w:type="spellEnd"/>
+        <w:t>aster</w:t>
+      </w:r>
       <w:r>
         <w:rPr>
           <w:rFonts w:ascii="Times New Roman" w:hAnsi="Times New Roman" w:cs="Times New Roman"/>
@@ -270,7 +286,23 @@
           <w:sz w:val="24"/>
           <w:szCs w:val="24"/>
         </w:rPr>
-        <w:t xml:space="preserve">. O banco de dados será usado para </w:t>
+        <w:t xml:space="preserve">. </w:t>
+      </w:r>
+      <w:r>
+        <w:rPr>
+          <w:rFonts w:ascii="Times New Roman" w:hAnsi="Times New Roman" w:cs="Times New Roman"/>
+          <w:sz w:val="24"/>
+          <w:szCs w:val="24"/>
+        </w:rPr>
+        <w:t>Um</w:t>
+      </w:r>
+      <w:r>
+        <w:rPr>
+          <w:rFonts w:ascii="Times New Roman" w:hAnsi="Times New Roman" w:cs="Times New Roman"/>
+          <w:sz w:val="24"/>
+          <w:szCs w:val="24"/>
+        </w:rPr>
+        <w:t xml:space="preserve"> banco de dados será usado para </w:t>
       </w:r>
       <w:r>
         <w:rPr>
@@ -325,7 +357,65 @@
           <w:sz w:val="24"/>
           <w:szCs w:val="24"/>
         </w:rPr>
-        <w:t>O escopo deste projeto abrange a modelagem conceitual, lógica e física do banco de dados, incluindo a definição de tabelas, relacionamentos, restrições, chaves primárias e estrangeiras, índices, e outras estruturas necessárias para atender aos requisitos do sistema.</w:t>
+        <w:t xml:space="preserve">O escopo deste projeto abrange a modelagem conceitual, lógica e física do banco de dados, incluindo a definição de tabelas, relacionamentos, restrições, chaves primárias e estrangeiras, </w:t>
+      </w:r>
+      <w:r>
+        <w:rPr>
+          <w:rFonts w:ascii="Times New Roman" w:hAnsi="Times New Roman" w:cs="Times New Roman"/>
+          <w:sz w:val="24"/>
+          <w:szCs w:val="24"/>
+        </w:rPr>
+        <w:t>gatilhos(</w:t>
+      </w:r>
+      <w:r>
+        <w:rPr>
+          <w:rFonts w:ascii="Times New Roman" w:hAnsi="Times New Roman" w:cs="Times New Roman"/>
+          <w:sz w:val="24"/>
+          <w:szCs w:val="24"/>
+          <w:lang w:val="pt-BR"/>
+        </w:rPr>
+        <w:t>triggers</w:t>
+      </w:r>
+      <w:r>
+        <w:rPr>
+          <w:rFonts w:ascii="Times New Roman" w:hAnsi="Times New Roman" w:cs="Times New Roman"/>
+          <w:sz w:val="24"/>
+          <w:szCs w:val="24"/>
+        </w:rPr>
+        <w:t>) e procedimentos armazenados</w:t>
+      </w:r>
+      <w:r>
+        <w:rPr>
+          <w:rFonts w:ascii="Times New Roman" w:hAnsi="Times New Roman" w:cs="Times New Roman"/>
+          <w:sz w:val="24"/>
+          <w:szCs w:val="24"/>
+        </w:rPr>
+        <w:t>(</w:t>
+      </w:r>
+      <w:r>
+        <w:rPr>
+          <w:rFonts w:ascii="Times New Roman" w:hAnsi="Times New Roman" w:cs="Times New Roman"/>
+          <w:sz w:val="24"/>
+          <w:szCs w:val="24"/>
+          <w:lang w:val="pt-BR"/>
+        </w:rPr>
+        <w:t>store procedures</w:t>
+      </w:r>
+      <w:r>
+        <w:rPr>
+          <w:rFonts w:ascii="Times New Roman" w:hAnsi="Times New Roman" w:cs="Times New Roman"/>
+          <w:sz w:val="24"/>
+          <w:szCs w:val="24"/>
+        </w:rPr>
+        <w:t>)</w:t>
+      </w:r>
+      <w:r>
+        <w:rPr>
+          <w:rFonts w:ascii="Times New Roman" w:hAnsi="Times New Roman" w:cs="Times New Roman"/>
+          <w:sz w:val="24"/>
+          <w:szCs w:val="24"/>
+        </w:rPr>
+        <w:t>, e outras estruturas necessárias para atender aos requisitos do sistema.</w:t>
       </w:r>
     </w:p>
     <w:p>
@@ -466,7 +556,23 @@
           <w:sz w:val="24"/>
           <w:szCs w:val="24"/>
         </w:rPr>
-        <w:t xml:space="preserve"> com informações detalhadas, incluído nome, </w:t>
+        <w:t xml:space="preserve"> com informações detalhadas, </w:t>
+      </w:r>
+      <w:r>
+        <w:rPr>
+          <w:rFonts w:ascii="Times New Roman" w:hAnsi="Times New Roman" w:cs="Times New Roman"/>
+          <w:sz w:val="24"/>
+          <w:szCs w:val="24"/>
+        </w:rPr>
+        <w:t>como informações ficais</w:t>
+      </w:r>
+      <w:r>
+        <w:rPr>
+          <w:rFonts w:ascii="Times New Roman" w:hAnsi="Times New Roman" w:cs="Times New Roman"/>
+          <w:sz w:val="24"/>
+          <w:szCs w:val="24"/>
+        </w:rPr>
+        <w:t xml:space="preserve">, </w:t>
       </w:r>
       <w:r>
         <w:rPr>
@@ -538,7 +644,15 @@
           <w:sz w:val="24"/>
           <w:szCs w:val="24"/>
         </w:rPr>
-        <w:t xml:space="preserve"> descontos </w:t>
+        <w:t xml:space="preserve"> condições de pagamento(seja a vista ou parcelado),</w:t>
+      </w:r>
+      <w:r>
+        <w:rPr>
+          <w:rFonts w:ascii="Times New Roman" w:hAnsi="Times New Roman" w:cs="Times New Roman"/>
+          <w:sz w:val="24"/>
+          <w:szCs w:val="24"/>
+        </w:rPr>
+        <w:t xml:space="preserve"> descontos se </w:t>
       </w:r>
       <w:r>
         <w:rPr>
@@ -547,7 +661,7 @@
           <w:szCs w:val="24"/>
         </w:rPr>
         <w:lastRenderedPageBreak/>
-        <w:t>se existirem, notas de credito e/ou debito, recibos e outros documentos de interesse comercial se necessário;</w:t>
+        <w:t>existirem, notas de credito e/ou debito, recibos e outros documentos de interesse comercial se necessário;</w:t>
       </w:r>
     </w:p>
     <w:p>
@@ -919,6 +1033,14 @@
         </w:rPr>
         <w:t>Produto</w:t>
       </w:r>
+      <w:r>
+        <w:rPr>
+          <w:rFonts w:ascii="Times New Roman" w:hAnsi="Times New Roman" w:cs="Times New Roman"/>
+          <w:sz w:val="24"/>
+          <w:szCs w:val="24"/>
+        </w:rPr>
+        <w:t>/Bens/Serviços/Artigos</w:t>
+      </w:r>
     </w:p>
     <w:p>
       <w:pPr>
@@ -941,7 +1063,7 @@
           <w:sz w:val="24"/>
           <w:szCs w:val="24"/>
         </w:rPr>
-        <w:t>Serviço</w:t>
+        <w:t>Taxa e/ou imposto</w:t>
       </w:r>
     </w:p>
     <w:p>
@@ -965,7 +1087,7 @@
           <w:sz w:val="24"/>
           <w:szCs w:val="24"/>
         </w:rPr>
-        <w:t>Taxa e/ou imposto</w:t>
+        <w:t>Descontos</w:t>
       </w:r>
     </w:p>
     <w:p>
@@ -989,7 +1111,7 @@
           <w:sz w:val="24"/>
           <w:szCs w:val="24"/>
         </w:rPr>
-        <w:t>Descontos</w:t>
+        <w:t>Armazém</w:t>
       </w:r>
     </w:p>
     <w:p>
@@ -1013,7 +1135,7 @@
           <w:sz w:val="24"/>
           <w:szCs w:val="24"/>
         </w:rPr>
-        <w:t>Armazém</w:t>
+        <w:t>Unidade de medida</w:t>
       </w:r>
     </w:p>
     <w:p>
@@ -1037,30 +1159,6 @@
           <w:sz w:val="24"/>
           <w:szCs w:val="24"/>
         </w:rPr>
-        <w:t>Unidade de medida</w:t>
-      </w:r>
-    </w:p>
-    <w:p>
-      <w:pPr>
-        <w:pStyle w:val="ListParagraph"/>
-        <w:numPr>
-          <w:ilvl w:val="0"/>
-          <w:numId w:val="8"/>
-        </w:numPr>
-        <w:spacing w:line="360" w:lineRule="auto"/>
-        <w:jc w:val="both"/>
-        <w:rPr>
-          <w:rFonts w:ascii="Times New Roman" w:hAnsi="Times New Roman" w:cs="Times New Roman"/>
-          <w:sz w:val="24"/>
-          <w:szCs w:val="24"/>
-        </w:rPr>
-      </w:pPr>
-      <w:r>
-        <w:rPr>
-          <w:rFonts w:ascii="Times New Roman" w:hAnsi="Times New Roman" w:cs="Times New Roman"/>
-          <w:sz w:val="24"/>
-          <w:szCs w:val="24"/>
-        </w:rPr>
         <w:t>Documentos comerciais</w:t>
       </w:r>
     </w:p>
@@ -1136,8 +1234,6 @@
         </w:rPr>
         <w:t xml:space="preserve"> </w:t>
       </w:r>
-      <w:bookmarkStart w:id="0" w:name="_GoBack"/>
-      <w:bookmarkEnd w:id="0"/>
     </w:p>
     <w:sectPr>
       <w:pgSz w:w="11906" w:h="16838"/>
@@ -1150,7 +1246,7 @@
 </file>
 
 <file path=word/numbering.xml><?xml version="1.0" encoding="utf-8"?>
-<w:numbering xmlns:wpc="http://schemas.microsoft.com/office/word/2010/wordprocessingCanvas" xmlns:cx="http://schemas.microsoft.com/office/drawing/2014/chartex" xmlns:mc="http://schemas.openxmlformats.org/markup-compatibility/2006" xmlns:o="urn:schemas-microsoft-com:office:office" xmlns:r="http://schemas.openxmlformats.org/officeDocument/2006/relationships" xmlns:m="http://schemas.openxmlformats.org/officeDocument/2006/math" xmlns:v="urn:schemas-microsoft-com:vml" xmlns:wp14="http://schemas.microsoft.com/office/word/2010/wordprocessingDrawing" xmlns:wp="http://schemas.openxmlformats.org/drawingml/2006/wordprocessingDrawing" xmlns:w10="urn:schemas-microsoft-com:office:word" xmlns:w="http://schemas.openxmlformats.org/wordprocessingml/2006/main" xmlns:w14="http://schemas.microsoft.com/office/word/2010/wordml" xmlns:w15="http://schemas.microsoft.com/office/word/2012/wordml" xmlns:w16se="http://schemas.microsoft.com/office/word/2015/wordml/symex" xmlns:wpg="http://schemas.microsoft.com/office/word/2010/wordprocessingGroup" xmlns:wpi="http://schemas.microsoft.com/office/word/2010/wordprocessingInk" xmlns:wne="http://schemas.microsoft.com/office/word/2006/wordml" xmlns:wps="http://schemas.microsoft.com/office/word/2010/wordprocessingShape" mc:Ignorable="w14 w15 w16se wp14">
+<w:numbering xmlns:wpc="http://schemas.microsoft.com/office/word/2010/wordprocessingCanvas" xmlns:cx="http://schemas.microsoft.com/office/drawing/2014/chartex" xmlns:cx1="http://schemas.microsoft.com/office/drawing/2015/9/8/chartex" xmlns:cx2="http://schemas.microsoft.com/office/drawing/2015/10/21/chartex" xmlns:cx3="http://schemas.microsoft.com/office/drawing/2016/5/9/chartex" xmlns:cx4="http://schemas.microsoft.com/office/drawing/2016/5/10/chartex" xmlns:cx5="http://schemas.microsoft.com/office/drawing/2016/5/11/chartex" xmlns:cx6="http://schemas.microsoft.com/office/drawing/2016/5/12/chartex" xmlns:cx7="http://schemas.microsoft.com/office/drawing/2016/5/13/chartex" xmlns:cx8="http://schemas.microsoft.com/office/drawing/2016/5/14/chartex" xmlns:mc="http://schemas.openxmlformats.org/markup-compatibility/2006" xmlns:aink="http://schemas.microsoft.com/office/drawing/2016/ink" xmlns:am3d="http://schemas.microsoft.com/office/drawing/2017/model3d" xmlns:o="urn:schemas-microsoft-com:office:office" xmlns:oel="http://schemas.microsoft.com/office/2019/extlst" xmlns:r="http://schemas.openxmlformats.org/officeDocument/2006/relationships" xmlns:m="http://schemas.openxmlformats.org/officeDocument/2006/math" xmlns:v="urn:schemas-microsoft-com:vml" xmlns:wp14="http://schemas.microsoft.com/office/word/2010/wordprocessingDrawing" xmlns:wp="http://schemas.openxmlformats.org/drawingml/2006/wordprocessingDrawing" xmlns:w10="urn:schemas-microsoft-com:office:word" xmlns:w="http://schemas.openxmlformats.org/wordprocessingml/2006/main" xmlns:w14="http://schemas.microsoft.com/office/word/2010/wordml" xmlns:w15="http://schemas.microsoft.com/office/word/2012/wordml" xmlns:w16cex="http://schemas.microsoft.com/office/word/2018/wordml/cex" xmlns:w16cid="http://schemas.microsoft.com/office/word/2016/wordml/cid" xmlns:w16="http://schemas.microsoft.com/office/word/2018/wordml" xmlns:w16du="http://schemas.microsoft.com/office/word/2023/wordml/word16du" xmlns:w16sdtdh="http://schemas.microsoft.com/office/word/2020/wordml/sdtdatahash" xmlns:w16se="http://schemas.microsoft.com/office/word/2015/wordml/symex" xmlns:wpg="http://schemas.microsoft.com/office/word/2010/wordprocessingGroup" xmlns:wpi="http://schemas.microsoft.com/office/word/2010/wordprocessingInk" xmlns:wne="http://schemas.microsoft.com/office/word/2006/wordml" xmlns:wps="http://schemas.microsoft.com/office/word/2010/wordprocessingShape" mc:Ignorable="w14 w15 w16se w16cid w16 w16cex w16sdtdh w16du wp14">
   <w:abstractNum w:abstractNumId="0" w15:restartNumberingAfterBreak="0">
     <w:nsid w:val="089A320F"/>
     <w:multiLevelType w:val="hybridMultilevel"/>
@@ -1946,35 +2042,35 @@
       </w:rPr>
     </w:lvl>
   </w:abstractNum>
-  <w:num w:numId="1">
+  <w:num w:numId="1" w16cid:durableId="2039238606">
     <w:abstractNumId w:val="4"/>
   </w:num>
-  <w:num w:numId="2">
+  <w:num w:numId="2" w16cid:durableId="1795103082">
     <w:abstractNumId w:val="7"/>
   </w:num>
-  <w:num w:numId="3">
+  <w:num w:numId="3" w16cid:durableId="732243634">
     <w:abstractNumId w:val="2"/>
   </w:num>
-  <w:num w:numId="4">
+  <w:num w:numId="4" w16cid:durableId="1860391108">
     <w:abstractNumId w:val="5"/>
   </w:num>
-  <w:num w:numId="5">
+  <w:num w:numId="5" w16cid:durableId="862665428">
     <w:abstractNumId w:val="0"/>
   </w:num>
-  <w:num w:numId="6">
+  <w:num w:numId="6" w16cid:durableId="868298433">
     <w:abstractNumId w:val="6"/>
   </w:num>
-  <w:num w:numId="7">
+  <w:num w:numId="7" w16cid:durableId="952789526">
     <w:abstractNumId w:val="3"/>
   </w:num>
-  <w:num w:numId="8">
+  <w:num w:numId="8" w16cid:durableId="1934778628">
     <w:abstractNumId w:val="1"/>
   </w:num>
 </w:numbering>
 </file>
 
 <file path=word/styles.xml><?xml version="1.0" encoding="utf-8"?>
-<w:styles xmlns:mc="http://schemas.openxmlformats.org/markup-compatibility/2006" xmlns:r="http://schemas.openxmlformats.org/officeDocument/2006/relationships" xmlns:w="http://schemas.openxmlformats.org/wordprocessingml/2006/main" xmlns:w14="http://schemas.microsoft.com/office/word/2010/wordml" xmlns:w15="http://schemas.microsoft.com/office/word/2012/wordml" xmlns:w16se="http://schemas.microsoft.com/office/word/2015/wordml/symex" mc:Ignorable="w14 w15 w16se">
+<w:styles xmlns:mc="http://schemas.openxmlformats.org/markup-compatibility/2006" xmlns:r="http://schemas.openxmlformats.org/officeDocument/2006/relationships" xmlns:w="http://schemas.openxmlformats.org/wordprocessingml/2006/main" xmlns:w14="http://schemas.microsoft.com/office/word/2010/wordml" xmlns:w15="http://schemas.microsoft.com/office/word/2012/wordml" xmlns:w16cex="http://schemas.microsoft.com/office/word/2018/wordml/cex" xmlns:w16cid="http://schemas.microsoft.com/office/word/2016/wordml/cid" xmlns:w16="http://schemas.microsoft.com/office/word/2018/wordml" xmlns:w16du="http://schemas.microsoft.com/office/word/2023/wordml/word16du" xmlns:w16sdtdh="http://schemas.microsoft.com/office/word/2020/wordml/sdtdatahash" xmlns:w16se="http://schemas.microsoft.com/office/word/2015/wordml/symex" mc:Ignorable="w14 w15 w16se w16cid w16 w16cex w16sdtdh w16du">
   <w:docDefaults>
     <w:rPrDefault>
       <w:rPr>
@@ -1990,7 +2086,7 @@
       </w:pPr>
     </w:pPrDefault>
   </w:docDefaults>
-  <w:latentStyles w:defLockedState="0" w:defUIPriority="99" w:defSemiHidden="0" w:defUnhideWhenUsed="0" w:defQFormat="0" w:count="371">
+  <w:latentStyles w:defLockedState="0" w:defUIPriority="99" w:defSemiHidden="0" w:defUnhideWhenUsed="0" w:defQFormat="0" w:count="376">
     <w:lsdException w:name="Normal" w:uiPriority="0" w:qFormat="1"/>
     <w:lsdException w:name="heading 1" w:uiPriority="9" w:qFormat="1"/>
     <w:lsdException w:name="heading 2" w:semiHidden="1" w:uiPriority="9" w:unhideWhenUsed="1" w:qFormat="1"/>
@@ -2362,6 +2458,11 @@
     <w:lsdException w:name="List Table 5 Dark Accent 6" w:uiPriority="50"/>
     <w:lsdException w:name="List Table 6 Colorful Accent 6" w:uiPriority="51"/>
     <w:lsdException w:name="List Table 7 Colorful Accent 6" w:uiPriority="52"/>
+    <w:lsdException w:name="Mention" w:semiHidden="1" w:unhideWhenUsed="1"/>
+    <w:lsdException w:name="Smart Hyperlink" w:semiHidden="1" w:unhideWhenUsed="1"/>
+    <w:lsdException w:name="Hashtag" w:semiHidden="1" w:unhideWhenUsed="1"/>
+    <w:lsdException w:name="Unresolved Mention" w:semiHidden="1" w:unhideWhenUsed="1"/>
+    <w:lsdException w:name="Smart Link" w:semiHidden="1" w:unhideWhenUsed="1"/>
   </w:latentStyles>
   <w:style w:type="paragraph" w:default="1" w:styleId="Normal">
     <w:name w:val="Normal"/>

</xml_diff>

<commit_message>
ajuste dos trigger no banco de dados a adicao do ficheiro de documentacao de banco de dados(Document_Project_JM-InvSM) com a documentacao inicial
</commit_message>
<xml_diff>
--- a/Projecto I - Modelagem de Dados.docx
+++ b/Projecto I - Modelagem de Dados.docx
@@ -1,6 +1,6 @@
 
 <file path=word/document.xml><?xml version="1.0" encoding="utf-8"?>
-<w:document xmlns:wpc="http://schemas.microsoft.com/office/word/2010/wordprocessingCanvas" xmlns:cx="http://schemas.microsoft.com/office/drawing/2014/chartex" xmlns:cx1="http://schemas.microsoft.com/office/drawing/2015/9/8/chartex" xmlns:cx2="http://schemas.microsoft.com/office/drawing/2015/10/21/chartex" xmlns:cx3="http://schemas.microsoft.com/office/drawing/2016/5/9/chartex" xmlns:cx4="http://schemas.microsoft.com/office/drawing/2016/5/10/chartex" xmlns:cx5="http://schemas.microsoft.com/office/drawing/2016/5/11/chartex" xmlns:cx6="http://schemas.microsoft.com/office/drawing/2016/5/12/chartex" xmlns:cx7="http://schemas.microsoft.com/office/drawing/2016/5/13/chartex" xmlns:cx8="http://schemas.microsoft.com/office/drawing/2016/5/14/chartex" xmlns:mc="http://schemas.openxmlformats.org/markup-compatibility/2006" xmlns:aink="http://schemas.microsoft.com/office/drawing/2016/ink" xmlns:am3d="http://schemas.microsoft.com/office/drawing/2017/model3d" xmlns:o="urn:schemas-microsoft-com:office:office" xmlns:oel="http://schemas.microsoft.com/office/2019/extlst" xmlns:r="http://schemas.openxmlformats.org/officeDocument/2006/relationships" xmlns:m="http://schemas.openxmlformats.org/officeDocument/2006/math" xmlns:v="urn:schemas-microsoft-com:vml" xmlns:wp14="http://schemas.microsoft.com/office/word/2010/wordprocessingDrawing" xmlns:wp="http://schemas.openxmlformats.org/drawingml/2006/wordprocessingDrawing" xmlns:w10="urn:schemas-microsoft-com:office:word" xmlns:w="http://schemas.openxmlformats.org/wordprocessingml/2006/main" xmlns:w14="http://schemas.microsoft.com/office/word/2010/wordml" xmlns:w15="http://schemas.microsoft.com/office/word/2012/wordml" xmlns:w16cex="http://schemas.microsoft.com/office/word/2018/wordml/cex" xmlns:w16cid="http://schemas.microsoft.com/office/word/2016/wordml/cid" xmlns:w16="http://schemas.microsoft.com/office/word/2018/wordml" xmlns:w16du="http://schemas.microsoft.com/office/word/2023/wordml/word16du" xmlns:w16sdtdh="http://schemas.microsoft.com/office/word/2020/wordml/sdtdatahash" xmlns:w16se="http://schemas.microsoft.com/office/word/2015/wordml/symex" xmlns:wpg="http://schemas.microsoft.com/office/word/2010/wordprocessingGroup" xmlns:wpi="http://schemas.microsoft.com/office/word/2010/wordprocessingInk" xmlns:wne="http://schemas.microsoft.com/office/word/2006/wordml" xmlns:wps="http://schemas.microsoft.com/office/word/2010/wordprocessingShape" mc:Ignorable="w14 w15 w16se w16cid w16 w16cex w16sdtdh w16du wp14">
+<w:document xmlns:wpc="http://schemas.microsoft.com/office/word/2010/wordprocessingCanvas" xmlns:cx="http://schemas.microsoft.com/office/drawing/2014/chartex" xmlns:cx1="http://schemas.microsoft.com/office/drawing/2015/9/8/chartex" xmlns:cx2="http://schemas.microsoft.com/office/drawing/2015/10/21/chartex" xmlns:cx3="http://schemas.microsoft.com/office/drawing/2016/5/9/chartex" xmlns:cx4="http://schemas.microsoft.com/office/drawing/2016/5/10/chartex" xmlns:cx5="http://schemas.microsoft.com/office/drawing/2016/5/11/chartex" xmlns:cx6="http://schemas.microsoft.com/office/drawing/2016/5/12/chartex" xmlns:cx7="http://schemas.microsoft.com/office/drawing/2016/5/13/chartex" xmlns:cx8="http://schemas.microsoft.com/office/drawing/2016/5/14/chartex" xmlns:mc="http://schemas.openxmlformats.org/markup-compatibility/2006" xmlns:aink="http://schemas.microsoft.com/office/drawing/2016/ink" xmlns:am3d="http://schemas.microsoft.com/office/drawing/2017/model3d" xmlns:o="urn:schemas-microsoft-com:office:office" xmlns:oel="http://schemas.microsoft.com/office/2019/extlst" xmlns:r="http://schemas.openxmlformats.org/officeDocument/2006/relationships" xmlns:m="http://schemas.openxmlformats.org/officeDocument/2006/math" xmlns:v="urn:schemas-microsoft-com:vml" xmlns:wp14="http://schemas.microsoft.com/office/word/2010/wordprocessingDrawing" xmlns:wp="http://schemas.openxmlformats.org/drawingml/2006/wordprocessingDrawing" xmlns:w10="urn:schemas-microsoft-com:office:word" xmlns:w="http://schemas.openxmlformats.org/wordprocessingml/2006/main" xmlns:w14="http://schemas.microsoft.com/office/word/2010/wordml" xmlns:w15="http://schemas.microsoft.com/office/word/2012/wordml" xmlns:w16cex="http://schemas.microsoft.com/office/word/2018/wordml/cex" xmlns:w16cid="http://schemas.microsoft.com/office/word/2016/wordml/cid" xmlns:w16="http://schemas.microsoft.com/office/word/2018/wordml" xmlns:w16du="http://schemas.microsoft.com/office/word/2023/wordml/word16du" xmlns:w16sdtdh="http://schemas.microsoft.com/office/word/2020/wordml/sdtdatahash" xmlns:w16sdtfl="http://schemas.microsoft.com/office/word/2024/wordml/sdtformatlock" xmlns:w16se="http://schemas.microsoft.com/office/word/2015/wordml/symex" xmlns:wpg="http://schemas.microsoft.com/office/word/2010/wordprocessingGroup" xmlns:wpi="http://schemas.microsoft.com/office/word/2010/wordprocessingInk" xmlns:wne="http://schemas.microsoft.com/office/word/2006/wordml" xmlns:wps="http://schemas.microsoft.com/office/word/2010/wordprocessingShape" mc:Ignorable="w14 w15 w16se w16cid w16 w16cex w16sdtdh w16sdtfl w16du wp14">
   <w:body>
     <w:p>
       <w:pPr>
@@ -121,18 +121,8 @@
           <w:sz w:val="24"/>
           <w:szCs w:val="24"/>
         </w:rPr>
-        <w:t>-</w:t>
-      </w:r>
-      <w:proofErr w:type="spellStart"/>
-      <w:r>
-        <w:rPr>
-          <w:rFonts w:ascii="Times New Roman" w:hAnsi="Times New Roman" w:cs="Times New Roman"/>
-          <w:sz w:val="24"/>
-          <w:szCs w:val="24"/>
-        </w:rPr>
-        <w:t>InvSM</w:t>
-      </w:r>
-      <w:proofErr w:type="spellEnd"/>
+        <w:t>-InvSM</w:t>
+      </w:r>
       <w:r>
         <w:rPr>
           <w:rFonts w:ascii="Times New Roman" w:hAnsi="Times New Roman" w:cs="Times New Roman"/>
@@ -184,7 +174,6 @@
         </w:rPr>
         <w:t xml:space="preserve"> </w:t>
       </w:r>
-      <w:proofErr w:type="spellStart"/>
       <w:r>
         <w:rPr>
           <w:rFonts w:ascii="Times New Roman" w:hAnsi="Times New Roman" w:cs="Times New Roman"/>
@@ -200,34 +189,15 @@
           <w:sz w:val="24"/>
           <w:szCs w:val="24"/>
         </w:rPr>
-        <w:t>nvoice</w:t>
-      </w:r>
-      <w:proofErr w:type="spellEnd"/>
-      <w:r>
-        <w:rPr>
-          <w:rFonts w:ascii="Times New Roman" w:hAnsi="Times New Roman" w:cs="Times New Roman"/>
-          <w:sz w:val="24"/>
-          <w:szCs w:val="24"/>
-        </w:rPr>
-        <w:t xml:space="preserve"> </w:t>
-      </w:r>
-      <w:proofErr w:type="spellStart"/>
-      <w:r>
-        <w:rPr>
-          <w:rFonts w:ascii="Times New Roman" w:hAnsi="Times New Roman" w:cs="Times New Roman"/>
-          <w:sz w:val="24"/>
-          <w:szCs w:val="24"/>
-        </w:rPr>
-        <w:t>and</w:t>
-      </w:r>
-      <w:proofErr w:type="spellEnd"/>
-      <w:r>
-        <w:rPr>
-          <w:rFonts w:ascii="Times New Roman" w:hAnsi="Times New Roman" w:cs="Times New Roman"/>
-          <w:sz w:val="24"/>
-          <w:szCs w:val="24"/>
-        </w:rPr>
-        <w:t xml:space="preserve"> </w:t>
+        <w:t xml:space="preserve">nvoice </w:t>
+      </w:r>
+      <w:r>
+        <w:rPr>
+          <w:rFonts w:ascii="Times New Roman" w:hAnsi="Times New Roman" w:cs="Times New Roman"/>
+          <w:sz w:val="24"/>
+          <w:szCs w:val="24"/>
+        </w:rPr>
+        <w:t xml:space="preserve">and </w:t>
       </w:r>
       <w:r>
         <w:rPr>
@@ -310,7 +280,23 @@
           <w:sz w:val="24"/>
           <w:szCs w:val="24"/>
         </w:rPr>
-        <w:t>armazenar informação dos clientes, fornecedores e produtos por eles fornecidos (entradas para o estoque), facturas emitidas (saídas do estoque) para os clientes, dados de pagamento das facturas, métodos de pagamento, notas de debito, créditos e outros documentos comercias de interesse, configurações do sistema, etc…</w:t>
+        <w:t>armazenar informação dos clientes, fornecedores e produtos por eles fornecidos (entradas para o estoque), facturas emitidas</w:t>
+      </w:r>
+      <w:r>
+        <w:rPr>
+          <w:rFonts w:ascii="Times New Roman" w:hAnsi="Times New Roman" w:cs="Times New Roman"/>
+          <w:sz w:val="24"/>
+          <w:szCs w:val="24"/>
+        </w:rPr>
+        <w:t xml:space="preserve"> e seus respectivos itens</w:t>
+      </w:r>
+      <w:r>
+        <w:rPr>
+          <w:rFonts w:ascii="Times New Roman" w:hAnsi="Times New Roman" w:cs="Times New Roman"/>
+          <w:sz w:val="24"/>
+          <w:szCs w:val="24"/>
+        </w:rPr>
+        <w:t xml:space="preserve"> (saídas do estoque) para os clientes, dados de pagamento das facturas, métodos de pagamento, notas de debito, créditos e outros documentos comercias de interesse, configurações do sistema, etc…</w:t>
       </w:r>
     </w:p>
     <w:p>
@@ -604,7 +590,23 @@
           <w:sz w:val="24"/>
           <w:szCs w:val="24"/>
         </w:rPr>
-        <w:t>Informação dos produtos e serviços devidamente categorizados, taxa e/ou impostos associados aos mesmos. Em caso de produtos, informações que relacionam o produto com o seu fornecedor, formas de medição ou contagem, quem efectuo a recepção dos mesmos (caso seja um produto), entre outras informações que sej</w:t>
+        <w:t>Informação dos produtos e</w:t>
+      </w:r>
+      <w:r>
+        <w:rPr>
+          <w:rFonts w:ascii="Times New Roman" w:hAnsi="Times New Roman" w:cs="Times New Roman"/>
+          <w:sz w:val="24"/>
+          <w:szCs w:val="24"/>
+        </w:rPr>
+        <w:t>/ou</w:t>
+      </w:r>
+      <w:r>
+        <w:rPr>
+          <w:rFonts w:ascii="Times New Roman" w:hAnsi="Times New Roman" w:cs="Times New Roman"/>
+          <w:sz w:val="24"/>
+          <w:szCs w:val="24"/>
+        </w:rPr>
+        <w:t xml:space="preserve"> serviços devidamente categorizados, taxa e/ou impostos associados aos mesmos. Em caso de produtos, informações que relacionam o produto com o seu fornecedor, formas de medição ou contagem, quem efectuo a recepção dos mesmos (caso seja um produto), entre outras informações que sej</w:t>
       </w:r>
       <w:r>
         <w:rPr>
@@ -644,15 +646,7 @@
           <w:sz w:val="24"/>
           <w:szCs w:val="24"/>
         </w:rPr>
-        <w:t xml:space="preserve"> condições de pagamento(seja a vista ou parcelado),</w:t>
-      </w:r>
-      <w:r>
-        <w:rPr>
-          <w:rFonts w:ascii="Times New Roman" w:hAnsi="Times New Roman" w:cs="Times New Roman"/>
-          <w:sz w:val="24"/>
-          <w:szCs w:val="24"/>
-        </w:rPr>
-        <w:t xml:space="preserve"> descontos se </w:t>
+        <w:t xml:space="preserve"> condições </w:t>
       </w:r>
       <w:r>
         <w:rPr>
@@ -661,7 +655,15 @@
           <w:szCs w:val="24"/>
         </w:rPr>
         <w:lastRenderedPageBreak/>
-        <w:t>existirem, notas de credito e/ou debito, recibos e outros documentos de interesse comercial se necessário;</w:t>
+        <w:t>de pagamento(seja a vista ou parcelado),</w:t>
+      </w:r>
+      <w:r>
+        <w:rPr>
+          <w:rFonts w:ascii="Times New Roman" w:hAnsi="Times New Roman" w:cs="Times New Roman"/>
+          <w:sz w:val="24"/>
+          <w:szCs w:val="24"/>
+        </w:rPr>
+        <w:t xml:space="preserve"> descontos se existirem, notas de credito e/ou debito, recibos e outros documentos de interesse comercial se necessário;</w:t>
       </w:r>
     </w:p>
     <w:p>
@@ -1172,7 +1174,6 @@
           <w:szCs w:val="24"/>
         </w:rPr>
       </w:pPr>
-      <w:proofErr w:type="spellStart"/>
       <w:r>
         <w:rPr>
           <w:rFonts w:ascii="Times New Roman" w:hAnsi="Times New Roman" w:cs="Times New Roman"/>
@@ -1187,52 +1188,7 @@
           <w:sz w:val="24"/>
           <w:szCs w:val="24"/>
         </w:rPr>
-        <w:t>bjfhg</w:t>
-      </w:r>
-      <w:proofErr w:type="spellEnd"/>
-      <w:r>
-        <w:rPr>
-          <w:rFonts w:ascii="Times New Roman" w:hAnsi="Times New Roman" w:cs="Times New Roman"/>
-          <w:sz w:val="24"/>
-          <w:szCs w:val="24"/>
-        </w:rPr>
-        <w:t xml:space="preserve"> </w:t>
-      </w:r>
-      <w:proofErr w:type="spellStart"/>
-      <w:r>
-        <w:rPr>
-          <w:rFonts w:ascii="Times New Roman" w:hAnsi="Times New Roman" w:cs="Times New Roman"/>
-          <w:sz w:val="24"/>
-          <w:szCs w:val="24"/>
-        </w:rPr>
-        <w:t>hjghjj</w:t>
-      </w:r>
-      <w:proofErr w:type="spellEnd"/>
-      <w:r>
-        <w:rPr>
-          <w:rFonts w:ascii="Times New Roman" w:hAnsi="Times New Roman" w:cs="Times New Roman"/>
-          <w:sz w:val="24"/>
-          <w:szCs w:val="24"/>
-        </w:rPr>
-        <w:t xml:space="preserve"> </w:t>
-      </w:r>
-      <w:proofErr w:type="spellStart"/>
-      <w:r>
-        <w:rPr>
-          <w:rFonts w:ascii="Times New Roman" w:hAnsi="Times New Roman" w:cs="Times New Roman"/>
-          <w:sz w:val="24"/>
-          <w:szCs w:val="24"/>
-        </w:rPr>
-        <w:t>hjffjf</w:t>
-      </w:r>
-      <w:proofErr w:type="spellEnd"/>
-      <w:r>
-        <w:rPr>
-          <w:rFonts w:ascii="Times New Roman" w:hAnsi="Times New Roman" w:cs="Times New Roman"/>
-          <w:sz w:val="24"/>
-          <w:szCs w:val="24"/>
-        </w:rPr>
-        <w:t xml:space="preserve"> </w:t>
+        <w:t xml:space="preserve">bjfhg hjghjj hjffjf </w:t>
       </w:r>
     </w:p>
     <w:sectPr>
@@ -1246,7 +1202,7 @@
 </file>
 
 <file path=word/numbering.xml><?xml version="1.0" encoding="utf-8"?>
-<w:numbering xmlns:wpc="http://schemas.microsoft.com/office/word/2010/wordprocessingCanvas" xmlns:cx="http://schemas.microsoft.com/office/drawing/2014/chartex" xmlns:cx1="http://schemas.microsoft.com/office/drawing/2015/9/8/chartex" xmlns:cx2="http://schemas.microsoft.com/office/drawing/2015/10/21/chartex" xmlns:cx3="http://schemas.microsoft.com/office/drawing/2016/5/9/chartex" xmlns:cx4="http://schemas.microsoft.com/office/drawing/2016/5/10/chartex" xmlns:cx5="http://schemas.microsoft.com/office/drawing/2016/5/11/chartex" xmlns:cx6="http://schemas.microsoft.com/office/drawing/2016/5/12/chartex" xmlns:cx7="http://schemas.microsoft.com/office/drawing/2016/5/13/chartex" xmlns:cx8="http://schemas.microsoft.com/office/drawing/2016/5/14/chartex" xmlns:mc="http://schemas.openxmlformats.org/markup-compatibility/2006" xmlns:aink="http://schemas.microsoft.com/office/drawing/2016/ink" xmlns:am3d="http://schemas.microsoft.com/office/drawing/2017/model3d" xmlns:o="urn:schemas-microsoft-com:office:office" xmlns:oel="http://schemas.microsoft.com/office/2019/extlst" xmlns:r="http://schemas.openxmlformats.org/officeDocument/2006/relationships" xmlns:m="http://schemas.openxmlformats.org/officeDocument/2006/math" xmlns:v="urn:schemas-microsoft-com:vml" xmlns:wp14="http://schemas.microsoft.com/office/word/2010/wordprocessingDrawing" xmlns:wp="http://schemas.openxmlformats.org/drawingml/2006/wordprocessingDrawing" xmlns:w10="urn:schemas-microsoft-com:office:word" xmlns:w="http://schemas.openxmlformats.org/wordprocessingml/2006/main" xmlns:w14="http://schemas.microsoft.com/office/word/2010/wordml" xmlns:w15="http://schemas.microsoft.com/office/word/2012/wordml" xmlns:w16cex="http://schemas.microsoft.com/office/word/2018/wordml/cex" xmlns:w16cid="http://schemas.microsoft.com/office/word/2016/wordml/cid" xmlns:w16="http://schemas.microsoft.com/office/word/2018/wordml" xmlns:w16du="http://schemas.microsoft.com/office/word/2023/wordml/word16du" xmlns:w16sdtdh="http://schemas.microsoft.com/office/word/2020/wordml/sdtdatahash" xmlns:w16se="http://schemas.microsoft.com/office/word/2015/wordml/symex" xmlns:wpg="http://schemas.microsoft.com/office/word/2010/wordprocessingGroup" xmlns:wpi="http://schemas.microsoft.com/office/word/2010/wordprocessingInk" xmlns:wne="http://schemas.microsoft.com/office/word/2006/wordml" xmlns:wps="http://schemas.microsoft.com/office/word/2010/wordprocessingShape" mc:Ignorable="w14 w15 w16se w16cid w16 w16cex w16sdtdh w16du wp14">
+<w:numbering xmlns:wpc="http://schemas.microsoft.com/office/word/2010/wordprocessingCanvas" xmlns:cx="http://schemas.microsoft.com/office/drawing/2014/chartex" xmlns:cx1="http://schemas.microsoft.com/office/drawing/2015/9/8/chartex" xmlns:cx2="http://schemas.microsoft.com/office/drawing/2015/10/21/chartex" xmlns:cx3="http://schemas.microsoft.com/office/drawing/2016/5/9/chartex" xmlns:cx4="http://schemas.microsoft.com/office/drawing/2016/5/10/chartex" xmlns:cx5="http://schemas.microsoft.com/office/drawing/2016/5/11/chartex" xmlns:cx6="http://schemas.microsoft.com/office/drawing/2016/5/12/chartex" xmlns:cx7="http://schemas.microsoft.com/office/drawing/2016/5/13/chartex" xmlns:cx8="http://schemas.microsoft.com/office/drawing/2016/5/14/chartex" xmlns:mc="http://schemas.openxmlformats.org/markup-compatibility/2006" xmlns:aink="http://schemas.microsoft.com/office/drawing/2016/ink" xmlns:am3d="http://schemas.microsoft.com/office/drawing/2017/model3d" xmlns:o="urn:schemas-microsoft-com:office:office" xmlns:oel="http://schemas.microsoft.com/office/2019/extlst" xmlns:r="http://schemas.openxmlformats.org/officeDocument/2006/relationships" xmlns:m="http://schemas.openxmlformats.org/officeDocument/2006/math" xmlns:v="urn:schemas-microsoft-com:vml" xmlns:wp14="http://schemas.microsoft.com/office/word/2010/wordprocessingDrawing" xmlns:wp="http://schemas.openxmlformats.org/drawingml/2006/wordprocessingDrawing" xmlns:w10="urn:schemas-microsoft-com:office:word" xmlns:w="http://schemas.openxmlformats.org/wordprocessingml/2006/main" xmlns:w14="http://schemas.microsoft.com/office/word/2010/wordml" xmlns:w15="http://schemas.microsoft.com/office/word/2012/wordml" xmlns:w16cex="http://schemas.microsoft.com/office/word/2018/wordml/cex" xmlns:w16cid="http://schemas.microsoft.com/office/word/2016/wordml/cid" xmlns:w16="http://schemas.microsoft.com/office/word/2018/wordml" xmlns:w16du="http://schemas.microsoft.com/office/word/2023/wordml/word16du" xmlns:w16sdtdh="http://schemas.microsoft.com/office/word/2020/wordml/sdtdatahash" xmlns:w16sdtfl="http://schemas.microsoft.com/office/word/2024/wordml/sdtformatlock" xmlns:w16se="http://schemas.microsoft.com/office/word/2015/wordml/symex" xmlns:wpg="http://schemas.microsoft.com/office/word/2010/wordprocessingGroup" xmlns:wpi="http://schemas.microsoft.com/office/word/2010/wordprocessingInk" xmlns:wne="http://schemas.microsoft.com/office/word/2006/wordml" xmlns:wps="http://schemas.microsoft.com/office/word/2010/wordprocessingShape" mc:Ignorable="w14 w15 w16se w16cid w16 w16cex w16sdtdh w16sdtfl w16du wp14">
   <w:abstractNum w:abstractNumId="0" w15:restartNumberingAfterBreak="0">
     <w:nsid w:val="089A320F"/>
     <w:multiLevelType w:val="hybridMultilevel"/>
@@ -2070,7 +2026,7 @@
 </file>
 
 <file path=word/styles.xml><?xml version="1.0" encoding="utf-8"?>
-<w:styles xmlns:mc="http://schemas.openxmlformats.org/markup-compatibility/2006" xmlns:r="http://schemas.openxmlformats.org/officeDocument/2006/relationships" xmlns:w="http://schemas.openxmlformats.org/wordprocessingml/2006/main" xmlns:w14="http://schemas.microsoft.com/office/word/2010/wordml" xmlns:w15="http://schemas.microsoft.com/office/word/2012/wordml" xmlns:w16cex="http://schemas.microsoft.com/office/word/2018/wordml/cex" xmlns:w16cid="http://schemas.microsoft.com/office/word/2016/wordml/cid" xmlns:w16="http://schemas.microsoft.com/office/word/2018/wordml" xmlns:w16du="http://schemas.microsoft.com/office/word/2023/wordml/word16du" xmlns:w16sdtdh="http://schemas.microsoft.com/office/word/2020/wordml/sdtdatahash" xmlns:w16se="http://schemas.microsoft.com/office/word/2015/wordml/symex" mc:Ignorable="w14 w15 w16se w16cid w16 w16cex w16sdtdh w16du">
+<w:styles xmlns:mc="http://schemas.openxmlformats.org/markup-compatibility/2006" xmlns:r="http://schemas.openxmlformats.org/officeDocument/2006/relationships" xmlns:w="http://schemas.openxmlformats.org/wordprocessingml/2006/main" xmlns:w14="http://schemas.microsoft.com/office/word/2010/wordml" xmlns:w15="http://schemas.microsoft.com/office/word/2012/wordml" xmlns:w16cex="http://schemas.microsoft.com/office/word/2018/wordml/cex" xmlns:w16cid="http://schemas.microsoft.com/office/word/2016/wordml/cid" xmlns:w16="http://schemas.microsoft.com/office/word/2018/wordml" xmlns:w16du="http://schemas.microsoft.com/office/word/2023/wordml/word16du" xmlns:w16sdtdh="http://schemas.microsoft.com/office/word/2020/wordml/sdtdatahash" xmlns:w16sdtfl="http://schemas.microsoft.com/office/word/2024/wordml/sdtformatlock" xmlns:w16se="http://schemas.microsoft.com/office/word/2015/wordml/symex" mc:Ignorable="w14 w15 w16se w16cid w16 w16cex w16sdtdh w16sdtfl w16du">
   <w:docDefaults>
     <w:rPrDefault>
       <w:rPr>

</xml_diff>